<commit_message>
feat(checkout): resolucion integral de cobro real Mercado Pago, mejoras UX y cancelacion de suscripciones
</commit_message>
<xml_diff>
--- a/DESCARGA_LECCIONES/Ciencias_OA01.docx
+++ b/DESCARGA_LECCIONES/Ciencias_OA01.docx
@@ -667,7 +667,7 @@
         <w:t xml:space="preserve">Objetivo para el Adulto / Mentor: </w:t>
       </w:r>
       <w:r>
-        <w:t xml:space="preserve">Guiar al estudiante a comprender que la sexualidad humana es una vivencia integral que comprende cuatro dimensiones inseparables: biológica, afectiva, social y ética, superando la visión reducida a lo estrictamente reproductivo.</w:t>
+        <w:t xml:space="preserve">Guiar al estudiante a comprender que la sexualidad humana es una vivencia integral que comprende cuatro dimensiones inseparables: biológica, afectiva, social y ética (Texto del Estudiante Ciencias Naturales 7° Básico MINEDUC, Unidad 1, Lección 1, pág. 16), superando la visión reducida a lo estrictamente reproductivo.</w:t>
       </w:r>
     </w:p>
     <w:p>
@@ -1137,7 +1137,7 @@
           <w:sz w:val="19"/>
           <w:szCs w:val="19"/>
         </w:rPr>
-        <w:t xml:space="preserve">Título en Pantalla (64 pt). Subtítulo en Pantalla (36 pt). Texto de un solo color brillante (ej. Blanco Brillante #FFFFFF), elegido para contrastar con el fondo de cada imagen, plano, sin sombras, contornos, resplandores ni recuadros flotantes o fondos detrás del texto. Protagonistas en el 100% de las escenas: la joven con trenzas y el joven con chaqueta cerceta interactuando activamente en cada escena.</w:t>
+        <w:t xml:space="preserve">Título en Pantalla (64 pt). Subtítulo en Pantalla (48 pt). Texto de un solo color brillante (ej. Blanco Brillante #FFFFFF), elegido para contrastar con el fondo de cada imagen, plano, sin sombras, contornos, resplandores ni recuadros flotantes o fondos detrás del texto. Protagonistas en el 100% de las escenas: la joven con trenzas y el joven con chaqueta cerceta interactuando activamente en cada escena.</w:t>
       </w:r>
     </w:p>
     <w:p>
@@ -1224,7 +1224,7 @@
                 <w:sz w:val="18"/>
                 <w:szCs w:val="18"/>
               </w:rPr>
-              <w:t xml:space="preserve">Textos en Pantalla (64 pt / 36 pt)</w:t>
+              <w:t xml:space="preserve">Textos en Pantalla (64 pt / 48 pt)</w:t>
             </w:r>
           </w:p>
         </w:tc>
@@ -1367,7 +1367,7 @@
                 <w:sz w:val="18"/>
                 <w:szCs w:val="18"/>
               </w:rPr>
-              <w:t xml:space="preserve">• Subtítulo (36 pt): </w:t>
+              <w:t xml:space="preserve">• Subtítulo (48 pt): </w:t>
             </w:r>
             <w:r>
               <w:rPr>
@@ -1542,7 +1542,7 @@
                 <w:sz w:val="18"/>
                 <w:szCs w:val="18"/>
               </w:rPr>
-              <w:t xml:space="preserve">• Subtítulo (36 pt): </w:t>
+              <w:t xml:space="preserve">• Subtítulo (48 pt): </w:t>
             </w:r>
             <w:r>
               <w:rPr>
@@ -1717,7 +1717,7 @@
                 <w:sz w:val="18"/>
                 <w:szCs w:val="18"/>
               </w:rPr>
-              <w:t xml:space="preserve">• Subtítulo (36 pt): </w:t>
+              <w:t xml:space="preserve">• Subtítulo (48 pt): </w:t>
             </w:r>
             <w:r>
               <w:rPr>
@@ -1892,7 +1892,7 @@
                 <w:sz w:val="18"/>
                 <w:szCs w:val="18"/>
               </w:rPr>
-              <w:t xml:space="preserve">• Subtítulo (36 pt): </w:t>
+              <w:t xml:space="preserve">• Subtítulo (48 pt): </w:t>
             </w:r>
             <w:r>
               <w:rPr>
@@ -2067,7 +2067,7 @@
                 <w:sz w:val="18"/>
                 <w:szCs w:val="18"/>
               </w:rPr>
-              <w:t xml:space="preserve">• Subtítulo (36 pt): </w:t>
+              <w:t xml:space="preserve">• Subtítulo (48 pt): </w:t>
             </w:r>
             <w:r>
               <w:rPr>
@@ -2102,7 +2102,7 @@
                 <w:sz w:val="17"/>
                 <w:szCs w:val="17"/>
               </w:rPr>
-              <w:t xml:space="preserve">Modern anime style 16:9 widescreen illustration. Two 13-year-old student explorers, a girl with braided hair and a boy in a teal jacket, observing a balanced scale emblem with glowing symbols of respect, personal limits, consent, and mutual dignity, with generous negative space for text overlays. No text drawn by AI.</w:t>
+              <w:t xml:space="preserve">Modern anime style 16:9 widescreen illustration. Two 13-year-old student explorers, a girl with braided hair and a boy in a teal jacket, observing a balanced scale illustration with glowing representations of respect, personal limits, consent, and mutual dignity, with generous negative space for text overlays. No text drawn by AI.</w:t>
             </w:r>
           </w:p>
           <w:p>
@@ -2242,7 +2242,7 @@
                 <w:sz w:val="18"/>
                 <w:szCs w:val="18"/>
               </w:rPr>
-              <w:t xml:space="preserve">• Subtítulo (36 pt): </w:t>
+              <w:t xml:space="preserve">• Subtítulo (48 pt): </w:t>
             </w:r>
             <w:r>
               <w:rPr>
@@ -2417,7 +2417,7 @@
                 <w:sz w:val="18"/>
                 <w:szCs w:val="18"/>
               </w:rPr>
-              <w:t xml:space="preserve">• Subtítulo (36 pt): </w:t>
+              <w:t xml:space="preserve">• Subtítulo (48 pt): </w:t>
             </w:r>
             <w:r>
               <w:rPr>
@@ -2452,7 +2452,7 @@
                 <w:sz w:val="17"/>
                 <w:szCs w:val="17"/>
               </w:rPr>
-              <w:t xml:space="preserve">Modern anime style 16:9 widescreen illustration. Two 13-year-old student explorers, a girl with braided hair and a boy in a teal jacket, smiling ready to investigate everyday cases with their science notebooks open beside a StudioSimple badge, with generous negative space for text overlays. No text drawn by AI.</w:t>
+              <w:t xml:space="preserve">Modern anime style 16:9 widescreen illustration. Two 13-year-old student explorers, a girl with braided hair and a boy in a teal jacket, smiling ready to investigate everyday cases with their science notebooks open in an organized study room, with generous negative space for text overlays. No text drawn by AI.</w:t>
             </w:r>
           </w:p>
           <w:p>
@@ -2783,7 +2783,7 @@
           <w:sz w:val="19"/>
           <w:szCs w:val="19"/>
         </w:rPr>
-        <w:t xml:space="preserve">Título en Pantalla (64 pt). Subtítulo en Pantalla (36 pt). Texto de un solo color brillante (ej. Blanco Brillante #FFFFFF), elegido para contrastar con el fondo de cada imagen, plano, sin sombras, contornos, resplandores ni recuadros flotantes o fondos detrás del texto. Protagonistas en el 100% de las escenas: la joven con trenzas y el joven con chaqueta cerceta interactuando activamente en cada escena.</w:t>
+        <w:t xml:space="preserve">Título en Pantalla (64 pt). Subtítulo en Pantalla (48 pt). Texto de un solo color brillante (ej. Blanco Brillante #FFFFFF), elegido para contrastar con el fondo de cada imagen, plano, sin sombras, contornos, resplandores ni recuadros flotantes o fondos detrás del texto. Protagonistas en el 100% de las escenas: la joven con trenzas y el joven con chaqueta cerceta interactuando activamente en cada escena.</w:t>
       </w:r>
     </w:p>
     <w:p>
@@ -2870,7 +2870,7 @@
                 <w:sz w:val="18"/>
                 <w:szCs w:val="18"/>
               </w:rPr>
-              <w:t xml:space="preserve">Textos en Pantalla (64 pt / 36 pt)</w:t>
+              <w:t xml:space="preserve">Textos en Pantalla (64 pt / 48 pt)</w:t>
             </w:r>
           </w:p>
         </w:tc>
@@ -3013,7 +3013,7 @@
                 <w:sz w:val="18"/>
                 <w:szCs w:val="18"/>
               </w:rPr>
-              <w:t xml:space="preserve">• Subtítulo (36 pt): </w:t>
+              <w:t xml:space="preserve">• Subtítulo (48 pt): </w:t>
             </w:r>
             <w:r>
               <w:rPr>
@@ -3188,7 +3188,7 @@
                 <w:sz w:val="18"/>
                 <w:szCs w:val="18"/>
               </w:rPr>
-              <w:t xml:space="preserve">• Subtítulo (36 pt): </w:t>
+              <w:t xml:space="preserve">• Subtítulo (48 pt): </w:t>
             </w:r>
             <w:r>
               <w:rPr>
@@ -3363,7 +3363,7 @@
                 <w:sz w:val="18"/>
                 <w:szCs w:val="18"/>
               </w:rPr>
-              <w:t xml:space="preserve">• Subtítulo (36 pt): </w:t>
+              <w:t xml:space="preserve">• Subtítulo (48 pt): </w:t>
             </w:r>
             <w:r>
               <w:rPr>
@@ -3538,7 +3538,7 @@
                 <w:sz w:val="18"/>
                 <w:szCs w:val="18"/>
               </w:rPr>
-              <w:t xml:space="preserve">• Subtítulo (36 pt): </w:t>
+              <w:t xml:space="preserve">• Subtítulo (48 pt): </w:t>
             </w:r>
             <w:r>
               <w:rPr>
@@ -3713,7 +3713,7 @@
                 <w:sz w:val="18"/>
                 <w:szCs w:val="18"/>
               </w:rPr>
-              <w:t xml:space="preserve">• Subtítulo (36 pt): </w:t>
+              <w:t xml:space="preserve">• Subtítulo (48 pt): </w:t>
             </w:r>
             <w:r>
               <w:rPr>
@@ -3748,7 +3748,7 @@
                 <w:sz w:val="17"/>
                 <w:szCs w:val="17"/>
               </w:rPr>
-              <w:t xml:space="preserve">Modern anime style 16:9 widescreen illustration. Two 13-year-old student explorers, a girl with braided hair and a boy in a teal jacket, holding a glowing cyan emblem of mutual respect, personal boundaries, and dignity, with generous negative space for text overlays. No text drawn by AI.</w:t>
+              <w:t xml:space="preserve">Modern anime style 16:9 widescreen illustration. Two 13-year-old student explorers, a girl with braided hair and a boy in a teal jacket, holding a glowing cyan symbolic compass of mutual respect, personal boundaries, and dignity, with generous negative space for text overlays. No text drawn by AI.</w:t>
             </w:r>
           </w:p>
           <w:p>
@@ -3843,7 +3843,7 @@
                 <w:sz w:val="17"/>
                 <w:szCs w:val="17"/>
               </w:rPr>
-              <w:t xml:space="preserve">Duración asignada: 19 s</w:t>
+              <w:t xml:space="preserve">Duración asignada: 18 s</w:t>
             </w:r>
           </w:p>
         </w:tc>
@@ -3888,7 +3888,7 @@
                 <w:sz w:val="18"/>
                 <w:szCs w:val="18"/>
               </w:rPr>
-              <w:t xml:space="preserve">• Subtítulo (36 pt): </w:t>
+              <w:t xml:space="preserve">• Subtítulo (48 pt): </w:t>
             </w:r>
             <w:r>
               <w:rPr>
@@ -3923,7 +3923,7 @@
                 <w:sz w:val="17"/>
                 <w:szCs w:val="17"/>
               </w:rPr>
-              <w:t xml:space="preserve">Modern anime style 16:9 widescreen illustration. Two 13-year-old student explorers, a girl with braided hair and a boy in a teal jacket, reviewing an illustrated daily hygiene, sleep schedule, and healthy meal chart on a study desk with clean lineart, with generous negative space for text overlays. No text drawn by AI.</w:t>
+              <w:t xml:space="preserve">Modern anime style 16:9 widescreen illustration. Two 13-year-old student explorers, a girl with braided hair and a boy in a teal jacket, reviewing an illustrated daily hygiene and sleep schedule routine on a study desk with clean lineart, with generous negative space for text overlays. No text drawn by AI.</w:t>
             </w:r>
           </w:p>
           <w:p>
@@ -3966,7 +3966,7 @@
                 <w:sz w:val="18"/>
                 <w:szCs w:val="18"/>
               </w:rPr>
-              <w:t xml:space="preserve">Analicemos un caso concreto: mantener hábitos de higiene diaria, descanso de ocho horas y alimentación sana para cuidar el cuerpo durante el crecimiento, ¿a qué dimensión corresponde? Corresponde a la dimensión biológica, porque beneficia directamente la salud, anatomía y bienestar del organismo.</w:t>
+              <w:t xml:space="preserve">Analicemos un caso concreto: mantener hábitos de higiene diaria, ropa limpia y dormir ocho horas para cuidar el cuerpo durante el crecimiento, ¿a qué dimensión corresponde? Corresponde a la dimensión biológica, porque beneficia directamente la salud, anatomía y bienestar del organismo.</w:t>
             </w:r>
           </w:p>
         </w:tc>
@@ -4063,7 +4063,7 @@
                 <w:sz w:val="18"/>
                 <w:szCs w:val="18"/>
               </w:rPr>
-              <w:t xml:space="preserve">• Subtítulo (36 pt): </w:t>
+              <w:t xml:space="preserve">• Subtítulo (48 pt): </w:t>
             </w:r>
             <w:r>
               <w:rPr>
@@ -4098,7 +4098,7 @@
                 <w:sz w:val="17"/>
                 <w:szCs w:val="17"/>
               </w:rPr>
-              <w:t xml:space="preserve">Modern anime style 16:9 widescreen illustration. Two 13-year-old student explorers, a girl with braided hair and a boy in a teal jacket, presenting a prominent balance diagram with all four dimensions working in dynamic equilibrium beside a StudioSimple emblem, with generous negative space for text overlays. No text drawn by AI.</w:t>
+              <w:t xml:space="preserve">Modern anime style 16:9 widescreen illustration. Two 13-year-old student explorers, a girl with braided hair and a boy in a teal jacket, presenting a prominent balance diagram with all four dimensions working in dynamic equilibrium in a bright modern science laboratory, with generous negative space for text overlays. No text drawn by AI.</w:t>
             </w:r>
           </w:p>
           <w:p>
@@ -4893,7 +4893,7 @@
         <w:t xml:space="preserve">Pregunta de Síntesis: </w:t>
       </w:r>
       <w:r>
-        <w:t xml:space="preserve"/>
+        <w:t xml:space="preserve">¿Por qué decimos que la sexualidad humana involucra cuatro dimensiones inseparables y no solo los cambios biológicos del cuerpo?</w:t>
       </w:r>
     </w:p>
     <w:p>
@@ -4908,7 +4908,7 @@
         <w:t xml:space="preserve">Reflexión Metacognitiva: </w:t>
       </w:r>
       <w:r>
-        <w:t xml:space="preserve"/>
+        <w:t xml:space="preserve">¿Qué dimensión de las cuatro te resultó más reveladora o te ayudó a comprender mejor los cambios que experimentas en esta etapa?</w:t>
       </w:r>
     </w:p>
     <w:p>
@@ -4924,7 +4924,7 @@
         <w:t xml:space="preserve">Celebración y Cierre: </w:t>
       </w:r>
       <w:r>
-        <w:t xml:space="preserve">Has completado la clase con exito.</w:t>
+        <w:t xml:space="preserve">¡Felicitaciones! Has completado con éxito la primera clase sobre las 4 dimensiones de la sexualidad humana.</w:t>
       </w:r>
     </w:p>
     <w:p>
@@ -5535,7 +5535,7 @@
         <w:t xml:space="preserve">Objetivo para el Adulto / Mentor: </w:t>
       </w:r>
       <w:r>
-        <w:t xml:space="preserve">Acompañar al estudiante a distinguir entre caracteres sexuales primarios y secundarios, reconociendo la acción del sistema endocrino en los cambios físicos y emocionales propios de la pubertad como un proceso biológico natural.</w:t>
+        <w:t xml:space="preserve">Acompañar al estudiante a distinguir entre caracteres sexuales primarios y secundarios, reconociendo la acción del sistema endocrino en los cambios físicos y emocionales propios de la pubertad, diferenciando el inicio puberal (8 a 13 años en niñas y 9 a 14 en niños) del estirón puberal de estatura (10 a 14 en niñas y 12 a 16 en niños) según los estadios de Tanner (1962) y orientaciones del MINEDUC.</w:t>
       </w:r>
     </w:p>
     <w:p>
@@ -6005,7 +6005,7 @@
           <w:sz w:val="19"/>
           <w:szCs w:val="19"/>
         </w:rPr>
-        <w:t xml:space="preserve">Título en Pantalla (64 pt). Subtítulo en Pantalla (36 pt). Texto de un solo color brillante (ej. Blanco Brillante #FFFFFF), elegido para contrastar con el fondo de cada imagen, plano, sin sombras, contornos, resplandores ni recuadros flotantes o fondos detrás del texto. Protagonistas en el 100% de las escenas: la joven con trenzas y el joven con chaqueta cerceta interactuando activamente en cada escena.</w:t>
+        <w:t xml:space="preserve">Título en Pantalla (64 pt). Subtítulo en Pantalla (48 pt). Texto de un solo color brillante (ej. Blanco Brillante #FFFFFF), elegido para contrastar con el fondo de cada imagen, plano, sin sombras, contornos, resplandores ni recuadros flotantes o fondos detrás del texto. Protagonistas en el 100% de las escenas: la joven con trenzas y el joven con chaqueta cerceta interactuando activamente en cada escena.</w:t>
       </w:r>
     </w:p>
     <w:p>
@@ -6092,7 +6092,7 @@
                 <w:sz w:val="18"/>
                 <w:szCs w:val="18"/>
               </w:rPr>
-              <w:t xml:space="preserve">Textos en Pantalla (64 pt / 36 pt)</w:t>
+              <w:t xml:space="preserve">Textos en Pantalla (64 pt / 48 pt)</w:t>
             </w:r>
           </w:p>
         </w:tc>
@@ -6235,7 +6235,7 @@
                 <w:sz w:val="18"/>
                 <w:szCs w:val="18"/>
               </w:rPr>
-              <w:t xml:space="preserve">• Subtítulo (36 pt): </w:t>
+              <w:t xml:space="preserve">• Subtítulo (48 pt): </w:t>
             </w:r>
             <w:r>
               <w:rPr>
@@ -6410,7 +6410,7 @@
                 <w:sz w:val="18"/>
                 <w:szCs w:val="18"/>
               </w:rPr>
-              <w:t xml:space="preserve">• Subtítulo (36 pt): </w:t>
+              <w:t xml:space="preserve">• Subtítulo (48 pt): </w:t>
             </w:r>
             <w:r>
               <w:rPr>
@@ -6585,7 +6585,7 @@
                 <w:sz w:val="18"/>
                 <w:szCs w:val="18"/>
               </w:rPr>
-              <w:t xml:space="preserve">• Subtítulo (36 pt): </w:t>
+              <w:t xml:space="preserve">• Subtítulo (48 pt): </w:t>
             </w:r>
             <w:r>
               <w:rPr>
@@ -6760,7 +6760,7 @@
                 <w:sz w:val="18"/>
                 <w:szCs w:val="18"/>
               </w:rPr>
-              <w:t xml:space="preserve">• Subtítulo (36 pt): </w:t>
+              <w:t xml:space="preserve">• Subtítulo (48 pt): </w:t>
             </w:r>
             <w:r>
               <w:rPr>
@@ -6935,7 +6935,7 @@
                 <w:sz w:val="18"/>
                 <w:szCs w:val="18"/>
               </w:rPr>
-              <w:t xml:space="preserve">• Subtítulo (36 pt): </w:t>
+              <w:t xml:space="preserve">• Subtítulo (48 pt): </w:t>
             </w:r>
             <w:r>
               <w:rPr>
@@ -7110,7 +7110,7 @@
                 <w:sz w:val="18"/>
                 <w:szCs w:val="18"/>
               </w:rPr>
-              <w:t xml:space="preserve">• Subtítulo (36 pt): </w:t>
+              <w:t xml:space="preserve">• Subtítulo (48 pt): </w:t>
             </w:r>
             <w:r>
               <w:rPr>
@@ -7285,7 +7285,7 @@
                 <w:sz w:val="18"/>
                 <w:szCs w:val="18"/>
               </w:rPr>
-              <w:t xml:space="preserve">• Subtítulo (36 pt): </w:t>
+              <w:t xml:space="preserve">• Subtítulo (48 pt): </w:t>
             </w:r>
             <w:r>
               <w:rPr>
@@ -7320,7 +7320,7 @@
                 <w:sz w:val="17"/>
                 <w:szCs w:val="17"/>
               </w:rPr>
-              <w:t xml:space="preserve">Modern anime style 16:9 widescreen illustration. Two 13-year-old student explorers, a girl with braided hair and a boy in a teal jacket, ready to classify developmental traits with their science notebooks open beside a StudioSimple badge, with generous negative space for text overlays. No text drawn by AI.</w:t>
+              <w:t xml:space="preserve">Modern anime style 16:9 widescreen illustration. Two 13-year-old student explorers, a girl with braided hair and a boy in a teal jacket, ready to classify developmental traits with their science notebooks open in an organized science study room, with generous negative space for text overlays. No text drawn by AI.</w:t>
             </w:r>
           </w:p>
           <w:p>
@@ -7651,7 +7651,7 @@
           <w:sz w:val="19"/>
           <w:szCs w:val="19"/>
         </w:rPr>
-        <w:t xml:space="preserve">Título en Pantalla (64 pt). Subtítulo en Pantalla (36 pt). Texto de un solo color brillante (ej. Blanco Brillante #FFFFFF), elegido para contrastar con el fondo de cada imagen, plano, sin sombras, contornos, resplandores ni recuadros flotantes o fondos detrás del texto. Protagonistas en el 100% de las escenas: la joven con trenzas y el joven con chaqueta cerceta interactuando activamente en cada escena.</w:t>
+        <w:t xml:space="preserve">Título en Pantalla (64 pt). Subtítulo en Pantalla (48 pt). Texto de un solo color brillante (ej. Blanco Brillante #FFFFFF), elegido para contrastar con el fondo de cada imagen, plano, sin sombras, contornos, resplandores ni recuadros flotantes o fondos detrás del texto. Protagonistas en el 100% de las escenas: la joven con trenzas y el joven con chaqueta cerceta interactuando activamente en cada escena.</w:t>
       </w:r>
     </w:p>
     <w:p>
@@ -7738,7 +7738,7 @@
                 <w:sz w:val="18"/>
                 <w:szCs w:val="18"/>
               </w:rPr>
-              <w:t xml:space="preserve">Textos en Pantalla (64 pt / 36 pt)</w:t>
+              <w:t xml:space="preserve">Textos en Pantalla (64 pt / 48 pt)</w:t>
             </w:r>
           </w:p>
         </w:tc>
@@ -7881,7 +7881,7 @@
                 <w:sz w:val="18"/>
                 <w:szCs w:val="18"/>
               </w:rPr>
-              <w:t xml:space="preserve">• Subtítulo (36 pt): </w:t>
+              <w:t xml:space="preserve">• Subtítulo (48 pt): </w:t>
             </w:r>
             <w:r>
               <w:rPr>
@@ -8056,7 +8056,7 @@
                 <w:sz w:val="18"/>
                 <w:szCs w:val="18"/>
               </w:rPr>
-              <w:t xml:space="preserve">• Subtítulo (36 pt): </w:t>
+              <w:t xml:space="preserve">• Subtítulo (48 pt): </w:t>
             </w:r>
             <w:r>
               <w:rPr>
@@ -8231,7 +8231,7 @@
                 <w:sz w:val="18"/>
                 <w:szCs w:val="18"/>
               </w:rPr>
-              <w:t xml:space="preserve">• Subtítulo (36 pt): </w:t>
+              <w:t xml:space="preserve">• Subtítulo (48 pt): </w:t>
             </w:r>
             <w:r>
               <w:rPr>
@@ -8361,7 +8361,7 @@
                 <w:sz w:val="17"/>
                 <w:szCs w:val="17"/>
               </w:rPr>
-              <w:t xml:space="preserve">Duración asignada: 14 s</w:t>
+              <w:t xml:space="preserve">Duración asignada: 17 s</w:t>
             </w:r>
           </w:p>
         </w:tc>
@@ -8406,7 +8406,7 @@
                 <w:sz w:val="18"/>
                 <w:szCs w:val="18"/>
               </w:rPr>
-              <w:t xml:space="preserve">• Subtítulo (36 pt): </w:t>
+              <w:t xml:space="preserve">• Subtítulo (48 pt): </w:t>
             </w:r>
             <w:r>
               <w:rPr>
@@ -8484,7 +8484,7 @@
                 <w:sz w:val="18"/>
                 <w:szCs w:val="18"/>
               </w:rPr>
-              <w:t xml:space="preserve">El ritmo de crecimiento varía entre personas. El estirón y la maduración ocurren entre los 10 y 16 años sin que existan diferencias de valor entre ritmos rápidos o lentos.</w:t>
+              <w:t xml:space="preserve">La pubertad inicia entre los 8 y 13 años en niñas y entre los 9 y 14 en niños, mientras que el estirón puberal ocurre entre los 10 y 14 en niñas y 12 a 16 en niños, según los estadios de Tanner (1962) y MINEDUC.</w:t>
             </w:r>
           </w:p>
         </w:tc>
@@ -8536,7 +8536,7 @@
                 <w:sz w:val="17"/>
                 <w:szCs w:val="17"/>
               </w:rPr>
-              <w:t xml:space="preserve">Duración asignada: 12 s</w:t>
+              <w:t xml:space="preserve">Duración asignada: 9 s</w:t>
             </w:r>
           </w:p>
         </w:tc>
@@ -8581,7 +8581,7 @@
                 <w:sz w:val="18"/>
                 <w:szCs w:val="18"/>
               </w:rPr>
-              <w:t xml:space="preserve">• Subtítulo (36 pt): </w:t>
+              <w:t xml:space="preserve">• Subtítulo (48 pt): </w:t>
             </w:r>
             <w:r>
               <w:rPr>
@@ -8659,7 +8659,7 @@
                 <w:sz w:val="18"/>
                 <w:szCs w:val="18"/>
               </w:rPr>
-              <w:t xml:space="preserve">La maduración puberal también impacta las emociones. La búsqueda de autonomía y las variaciones del estado de ánimo requieren comunicación empática y diálogo cercano en el hogar.</w:t>
+              <w:t xml:space="preserve">La maduración puberal también impacta las emociones y la autonomía, requiriendo comunicación empática y diálogo cercano en el hogar.</w:t>
             </w:r>
           </w:p>
         </w:tc>
@@ -8711,7 +8711,7 @@
                 <w:sz w:val="17"/>
                 <w:szCs w:val="17"/>
               </w:rPr>
-              <w:t xml:space="preserve">Duración asignada: 24 s</w:t>
+              <w:t xml:space="preserve">Duración asignada: 14 s</w:t>
             </w:r>
           </w:p>
         </w:tc>
@@ -8756,7 +8756,7 @@
                 <w:sz w:val="18"/>
                 <w:szCs w:val="18"/>
               </w:rPr>
-              <w:t xml:space="preserve">• Subtítulo (36 pt): </w:t>
+              <w:t xml:space="preserve">• Subtítulo (48 pt): </w:t>
             </w:r>
             <w:r>
               <w:rPr>
@@ -8834,7 +8834,7 @@
                 <w:sz w:val="18"/>
                 <w:szCs w:val="18"/>
               </w:rPr>
-              <w:t xml:space="preserve">Analicemos un caso concreto: identificar si el cambio en el tono de la voz y el aumento acelerado de estatura corresponden a caracteres primarios o secundarios, y justificarlo biológicamente. Corresponden a caracteres sexuales secundarios, porque se manifiestan durante la pubertad por estímulo de las hormonas sexuales y no están presentes desde el nacimiento.</w:t>
+              <w:t xml:space="preserve">Analicemos un caso concreto: el cambio de voz y el aumento de estatura corresponden a caracteres secundarios, ya que surgen en la pubertad por estímulo hormonal y no estaban al nacer.</w:t>
             </w:r>
           </w:p>
         </w:tc>
@@ -8931,7 +8931,7 @@
                 <w:sz w:val="18"/>
                 <w:szCs w:val="18"/>
               </w:rPr>
-              <w:t xml:space="preserve">• Subtítulo (36 pt): </w:t>
+              <w:t xml:space="preserve">• Subtítulo (48 pt): </w:t>
             </w:r>
             <w:r>
               <w:rPr>
@@ -8966,7 +8966,7 @@
                 <w:sz w:val="17"/>
                 <w:szCs w:val="17"/>
               </w:rPr>
-              <w:t xml:space="preserve">Modern anime style 16:9 widescreen illustration. Two 13-year-old student explorers, a girl with braided hair and a boy in a teal jacket, presenting a two-part diagram contrasting primary organs from birth with pubertal secondary traits beside a StudioSimple emblem, with generous negative space for text overlays. No text drawn by AI.</w:t>
+              <w:t xml:space="preserve">Modern anime style 16:9 widescreen illustration. Two 13-year-old student explorers, a girl with braided hair and a boy in a teal jacket, presenting a two-part diagram contrasting primary organs from birth with pubertal secondary traits in a bright science laboratory, with generous negative space for text overlays. No text drawn by AI.</w:t>
             </w:r>
           </w:p>
           <w:p>
@@ -9761,7 +9761,7 @@
         <w:t xml:space="preserve">Pregunta de Síntesis: </w:t>
       </w:r>
       <w:r>
-        <w:t xml:space="preserve"/>
+        <w:t xml:space="preserve">¿Cuál es la diferencia biológica fundamental entre un carácter sexual primario y uno secundario, y qué sistema corporal activa su aparición?</w:t>
       </w:r>
     </w:p>
     <w:p>
@@ -9776,7 +9776,7 @@
         <w:t xml:space="preserve">Reflexión Metacognitiva: </w:t>
       </w:r>
       <w:r>
-        <w:t xml:space="preserve"/>
+        <w:t xml:space="preserve">¿De qué manera comprender los estadios de maduración de Tanner y los ritmos individuales te ayuda a normalizar los cambios físicos que experimentas junto a tus compañeros?</w:t>
       </w:r>
     </w:p>
     <w:p>
@@ -9792,7 +9792,7 @@
         <w:t xml:space="preserve">Celebración y Cierre: </w:t>
       </w:r>
       <w:r>
-        <w:t xml:space="preserve">Has completado la clase con exito.</w:t>
+        <w:t xml:space="preserve">¡Felicitaciones! Has completado con éxito la lección sobre transformaciones físicas y emocionales de la pubertad.</w:t>
       </w:r>
     </w:p>
     <w:p>
@@ -10873,7 +10873,7 @@
           <w:sz w:val="19"/>
           <w:szCs w:val="19"/>
         </w:rPr>
-        <w:t xml:space="preserve">Título en Pantalla (64 pt). Subtítulo en Pantalla (36 pt). Texto de un solo color brillante (ej. Blanco Brillante #FFFFFF), elegido para contrastar con el fondo de cada imagen, plano, sin sombras, contornos, resplandores ni recuadros flotantes o fondos detrás del texto. Protagonistas en el 100% de las escenas: la joven con trenzas y el joven con chaqueta cerceta interactuando activamente en cada escena.</w:t>
+        <w:t xml:space="preserve">Título en Pantalla (64 pt). Subtítulo en Pantalla (48 pt). Texto de un solo color brillante (ej. Blanco Brillante #FFFFFF), elegido para contrastar con el fondo de cada imagen, plano, sin sombras, contornos, resplandores ni recuadros flotantes o fondos detrás del texto. Protagonistas en el 100% de las escenas: la joven con trenzas y el joven con chaqueta cerceta interactuando activamente en cada escena.</w:t>
       </w:r>
     </w:p>
     <w:p>
@@ -10960,7 +10960,7 @@
                 <w:sz w:val="18"/>
                 <w:szCs w:val="18"/>
               </w:rPr>
-              <w:t xml:space="preserve">Textos en Pantalla (64 pt / 36 pt)</w:t>
+              <w:t xml:space="preserve">Textos en Pantalla (64 pt / 48 pt)</w:t>
             </w:r>
           </w:p>
         </w:tc>
@@ -11103,7 +11103,7 @@
                 <w:sz w:val="18"/>
                 <w:szCs w:val="18"/>
               </w:rPr>
-              <w:t xml:space="preserve">• Subtítulo (36 pt): </w:t>
+              <w:t xml:space="preserve">• Subtítulo (48 pt): </w:t>
             </w:r>
             <w:r>
               <w:rPr>
@@ -11278,7 +11278,7 @@
                 <w:sz w:val="18"/>
                 <w:szCs w:val="18"/>
               </w:rPr>
-              <w:t xml:space="preserve">• Subtítulo (36 pt): </w:t>
+              <w:t xml:space="preserve">• Subtítulo (48 pt): </w:t>
             </w:r>
             <w:r>
               <w:rPr>
@@ -11453,7 +11453,7 @@
                 <w:sz w:val="18"/>
                 <w:szCs w:val="18"/>
               </w:rPr>
-              <w:t xml:space="preserve">• Subtítulo (36 pt): </w:t>
+              <w:t xml:space="preserve">• Subtítulo (48 pt): </w:t>
             </w:r>
             <w:r>
               <w:rPr>
@@ -11628,7 +11628,7 @@
                 <w:sz w:val="18"/>
                 <w:szCs w:val="18"/>
               </w:rPr>
-              <w:t xml:space="preserve">• Subtítulo (36 pt): </w:t>
+              <w:t xml:space="preserve">• Subtítulo (48 pt): </w:t>
             </w:r>
             <w:r>
               <w:rPr>
@@ -11663,7 +11663,7 @@
                 <w:sz w:val="17"/>
                 <w:szCs w:val="17"/>
               </w:rPr>
-              <w:t xml:space="preserve">Modern anime style 16:9 widescreen illustration. Two 13-year-old student explorers, a girl with braided hair and a boy in a teal jacket, holding a symbolic glowing blue emblem representing personal boundaries, intimacy, and family privacy, with generous negative space for text overlays. No text drawn by AI.</w:t>
+              <w:t xml:space="preserve">Modern anime style 16:9 widescreen illustration. Two 13-year-old student explorers, a girl with braided hair and a boy in a teal jacket, holding an illustrated symbolic boundary indicator representing personal boundaries, intimacy, and family privacy, with generous negative space for text overlays. No text drawn by AI.</w:t>
             </w:r>
           </w:p>
           <w:p>
@@ -11803,7 +11803,7 @@
                 <w:sz w:val="18"/>
                 <w:szCs w:val="18"/>
               </w:rPr>
-              <w:t xml:space="preserve">• Subtítulo (36 pt): </w:t>
+              <w:t xml:space="preserve">• Subtítulo (48 pt): </w:t>
             </w:r>
             <w:r>
               <w:rPr>
@@ -11978,7 +11978,7 @@
                 <w:sz w:val="18"/>
                 <w:szCs w:val="18"/>
               </w:rPr>
-              <w:t xml:space="preserve">• Subtítulo (36 pt): </w:t>
+              <w:t xml:space="preserve">• Subtítulo (48 pt): </w:t>
             </w:r>
             <w:r>
               <w:rPr>
@@ -12153,7 +12153,7 @@
                 <w:sz w:val="18"/>
                 <w:szCs w:val="18"/>
               </w:rPr>
-              <w:t xml:space="preserve">• Subtítulo (36 pt): </w:t>
+              <w:t xml:space="preserve">• Subtítulo (48 pt): </w:t>
             </w:r>
             <w:r>
               <w:rPr>
@@ -12188,7 +12188,7 @@
                 <w:sz w:val="17"/>
                 <w:szCs w:val="17"/>
               </w:rPr>
-              <w:t xml:space="preserve">Modern anime style 16:9 widescreen illustration. Two 13-year-old student explorers, a girl with braided hair and a boy in a teal jacket, holding open science notebooks, ready to investigate interpersonal cases beside a StudioSimple badge, with generous negative space for text overlays. No text drawn by AI.</w:t>
+              <w:t xml:space="preserve">Modern anime style 16:9 widescreen illustration. Two 13-year-old student explorers, a girl with braided hair and a boy in a teal jacket, holding open science notebooks, ready to investigate interpersonal cases in a warm modern study room, with generous negative space for text overlays. No text drawn by AI.</w:t>
             </w:r>
           </w:p>
           <w:p>
@@ -12519,7 +12519,7 @@
           <w:sz w:val="19"/>
           <w:szCs w:val="19"/>
         </w:rPr>
-        <w:t xml:space="preserve">Título en Pantalla (64 pt). Subtítulo en Pantalla (36 pt). Texto de un solo color brillante (ej. Blanco Brillante #FFFFFF), elegido para contrastar con el fondo de cada imagen, plano, sin sombras, contornos, resplandores ni recuadros flotantes o fondos detrás del texto. Protagonistas en el 100% de las escenas: la joven con trenzas y el joven con chaqueta cerceta interactuando activamente en cada escena.</w:t>
+        <w:t xml:space="preserve">Título en Pantalla (64 pt). Subtítulo en Pantalla (48 pt). Texto de un solo color brillante (ej. Blanco Brillante #FFFFFF), elegido para contrastar con el fondo de cada imagen, plano, sin sombras, contornos, resplandores ni recuadros flotantes o fondos detrás del texto. Protagonistas en el 100% de las escenas: la joven con trenzas y el joven con chaqueta cerceta interactuando activamente en cada escena.</w:t>
       </w:r>
     </w:p>
     <w:p>
@@ -12606,7 +12606,7 @@
                 <w:sz w:val="18"/>
                 <w:szCs w:val="18"/>
               </w:rPr>
-              <w:t xml:space="preserve">Textos en Pantalla (64 pt / 36 pt)</w:t>
+              <w:t xml:space="preserve">Textos en Pantalla (64 pt / 48 pt)</w:t>
             </w:r>
           </w:p>
         </w:tc>
@@ -12749,7 +12749,7 @@
                 <w:sz w:val="18"/>
                 <w:szCs w:val="18"/>
               </w:rPr>
-              <w:t xml:space="preserve">• Subtítulo (36 pt): </w:t>
+              <w:t xml:space="preserve">• Subtítulo (48 pt): </w:t>
             </w:r>
             <w:r>
               <w:rPr>
@@ -12924,7 +12924,7 @@
                 <w:sz w:val="18"/>
                 <w:szCs w:val="18"/>
               </w:rPr>
-              <w:t xml:space="preserve">• Subtítulo (36 pt): </w:t>
+              <w:t xml:space="preserve">• Subtítulo (48 pt): </w:t>
             </w:r>
             <w:r>
               <w:rPr>
@@ -13099,7 +13099,7 @@
                 <w:sz w:val="18"/>
                 <w:szCs w:val="18"/>
               </w:rPr>
-              <w:t xml:space="preserve">• Subtítulo (36 pt): </w:t>
+              <w:t xml:space="preserve">• Subtítulo (48 pt): </w:t>
             </w:r>
             <w:r>
               <w:rPr>
@@ -13134,7 +13134,7 @@
                 <w:sz w:val="17"/>
                 <w:szCs w:val="17"/>
               </w:rPr>
-              <w:t xml:space="preserve">Modern anime style 16:9 widescreen illustration. Two 13-year-old student explorers, a girl with braided hair and a boy in a teal jacket, keeping personal confidences safe beside a study desk with a glowing lock and diary emblem, with generous negative space for text overlays. No text drawn by AI.</w:t>
+              <w:t xml:space="preserve">Modern anime style 16:9 widescreen illustration. Two 13-year-old student explorers, a girl with braided hair and a boy in a teal jacket, keeping personal confidences safe beside a study desk with an illustrated lock and diary, with generous negative space for text overlays. No text drawn by AI.</w:t>
             </w:r>
           </w:p>
           <w:p>
@@ -13274,7 +13274,7 @@
                 <w:sz w:val="18"/>
                 <w:szCs w:val="18"/>
               </w:rPr>
-              <w:t xml:space="preserve">• Subtítulo (36 pt): </w:t>
+              <w:t xml:space="preserve">• Subtítulo (48 pt): </w:t>
             </w:r>
             <w:r>
               <w:rPr>
@@ -13449,7 +13449,7 @@
                 <w:sz w:val="18"/>
                 <w:szCs w:val="18"/>
               </w:rPr>
-              <w:t xml:space="preserve">• Subtítulo (36 pt): </w:t>
+              <w:t xml:space="preserve">• Subtítulo (48 pt): </w:t>
             </w:r>
             <w:r>
               <w:rPr>
@@ -13624,7 +13624,7 @@
                 <w:sz w:val="18"/>
                 <w:szCs w:val="18"/>
               </w:rPr>
-              <w:t xml:space="preserve">• Subtítulo (36 pt): </w:t>
+              <w:t xml:space="preserve">• Subtítulo (48 pt): </w:t>
             </w:r>
             <w:r>
               <w:rPr>
@@ -13799,7 +13799,7 @@
                 <w:sz w:val="18"/>
                 <w:szCs w:val="18"/>
               </w:rPr>
-              <w:t xml:space="preserve">• Subtítulo (36 pt): </w:t>
+              <w:t xml:space="preserve">• Subtítulo (48 pt): </w:t>
             </w:r>
             <w:r>
               <w:rPr>
@@ -13834,7 +13834,7 @@
                 <w:sz w:val="17"/>
                 <w:szCs w:val="17"/>
               </w:rPr>
-              <w:t xml:space="preserve">Modern anime style 16:9 widescreen illustration. Two 13-year-old student explorers, a girl with braided hair and a boy in a teal jacket, presenting a three-pillar diagram of empathy, reciprocity, and intimacy beside a StudioSimple emblem, with generous negative space for text overlays. No text drawn by AI.</w:t>
+              <w:t xml:space="preserve">Modern anime style 16:9 widescreen illustration. Two 13-year-old student explorers, a girl with braided hair and a boy in a teal jacket, presenting a three-pillar diagram of empathy, reciprocity, and intimacy in a brightly lit study environment, with generous negative space for text overlays. No text drawn by AI.</w:t>
             </w:r>
           </w:p>
           <w:p>
@@ -14629,7 +14629,7 @@
         <w:t xml:space="preserve">Pregunta de Síntesis: </w:t>
       </w:r>
       <w:r>
-        <w:t xml:space="preserve"/>
+        <w:t xml:space="preserve">¿De qué manera la empatía y la reciprocidad protegen el espacio de intimidad y evitan relaciones basadas en la imposición?</w:t>
       </w:r>
     </w:p>
     <w:p>
@@ -14644,7 +14644,7 @@
         <w:t xml:space="preserve">Reflexión Metacognitiva: </w:t>
       </w:r>
       <w:r>
-        <w:t xml:space="preserve"/>
+        <w:t xml:space="preserve">¿En qué momento de la lección identificaste con mayor claridad la importancia de resguardar la privacidad propia y ajena en el entorno digital?</w:t>
       </w:r>
     </w:p>
     <w:p>
@@ -14660,7 +14660,7 @@
         <w:t xml:space="preserve">Celebración y Cierre: </w:t>
       </w:r>
       <w:r>
-        <w:t xml:space="preserve">Has completado la clase con exito.</w:t>
+        <w:t xml:space="preserve">¡Felicitaciones! Has completado con éxito la lección sobre vínculos afectivos, respeto mutuo e intimidad.</w:t>
       </w:r>
     </w:p>
     <w:p>
@@ -15741,7 +15741,7 @@
           <w:sz w:val="19"/>
           <w:szCs w:val="19"/>
         </w:rPr>
-        <w:t xml:space="preserve">Título en Pantalla (64 pt). Subtítulo en Pantalla (36 pt). Texto de un solo color brillante (ej. Blanco Brillante #FFFFFF), elegido para contrastar con el fondo de cada imagen, plano, sin sombras, contornos, resplandores ni recuadros flotantes o fondos detrás del texto. Protagonistas en el 100% de las escenas: la joven con trenzas y el joven con chaqueta cerceta interactuando activamente en cada escena.</w:t>
+        <w:t xml:space="preserve">Título en Pantalla (64 pt). Subtítulo en Pantalla (48 pt). Texto de un solo color brillante (ej. Blanco Brillante #FFFFFF), elegido para contrastar con el fondo de cada imagen, plano, sin sombras, contornos, resplandores ni recuadros flotantes o fondos detrás del texto. Protagonistas en el 100% de las escenas: la joven con trenzas y el joven con chaqueta cerceta interactuando activamente en cada escena.</w:t>
       </w:r>
     </w:p>
     <w:p>
@@ -15828,7 +15828,7 @@
                 <w:sz w:val="18"/>
                 <w:szCs w:val="18"/>
               </w:rPr>
-              <w:t xml:space="preserve">Textos en Pantalla (64 pt / 36 pt)</w:t>
+              <w:t xml:space="preserve">Textos en Pantalla (64 pt / 48 pt)</w:t>
             </w:r>
           </w:p>
         </w:tc>
@@ -15971,7 +15971,7 @@
                 <w:sz w:val="18"/>
                 <w:szCs w:val="18"/>
               </w:rPr>
-              <w:t xml:space="preserve">• Subtítulo (36 pt): </w:t>
+              <w:t xml:space="preserve">• Subtítulo (48 pt): </w:t>
             </w:r>
             <w:r>
               <w:rPr>
@@ -16146,7 +16146,7 @@
                 <w:sz w:val="18"/>
                 <w:szCs w:val="18"/>
               </w:rPr>
-              <w:t xml:space="preserve">• Subtítulo (36 pt): </w:t>
+              <w:t xml:space="preserve">• Subtítulo (48 pt): </w:t>
             </w:r>
             <w:r>
               <w:rPr>
@@ -16321,7 +16321,7 @@
                 <w:sz w:val="18"/>
                 <w:szCs w:val="18"/>
               </w:rPr>
-              <w:t xml:space="preserve">• Subtítulo (36 pt): </w:t>
+              <w:t xml:space="preserve">• Subtítulo (48 pt): </w:t>
             </w:r>
             <w:r>
               <w:rPr>
@@ -16496,7 +16496,7 @@
                 <w:sz w:val="18"/>
                 <w:szCs w:val="18"/>
               </w:rPr>
-              <w:t xml:space="preserve">• Subtítulo (36 pt): </w:t>
+              <w:t xml:space="preserve">• Subtítulo (48 pt): </w:t>
             </w:r>
             <w:r>
               <w:rPr>
@@ -16671,7 +16671,7 @@
                 <w:sz w:val="18"/>
                 <w:szCs w:val="18"/>
               </w:rPr>
-              <w:t xml:space="preserve">• Subtítulo (36 pt): </w:t>
+              <w:t xml:space="preserve">• Subtítulo (48 pt): </w:t>
             </w:r>
             <w:r>
               <w:rPr>
@@ -16706,7 +16706,7 @@
                 <w:sz w:val="17"/>
                 <w:szCs w:val="17"/>
               </w:rPr>
-              <w:t xml:space="preserve">Modern anime style 16:9 widescreen illustration. Two 13-year-old student explorers, a girl with braided hair and a boy in a teal jacket, holding a protective shield emblem safeguarding personal space and digital privacy against peer pressure, with generous negative space for text overlays. No text drawn by AI.</w:t>
+              <w:t xml:space="preserve">Modern anime style 16:9 widescreen illustration. Two 13-year-old student explorers, a girl with braided hair and a boy in a teal jacket, holding an illustrated protective symbolic boundary safeguarding personal space and digital privacy against peer pressure, with generous negative space for text overlays. No text drawn by AI.</w:t>
             </w:r>
           </w:p>
           <w:p>
@@ -16846,7 +16846,7 @@
                 <w:sz w:val="18"/>
                 <w:szCs w:val="18"/>
               </w:rPr>
-              <w:t xml:space="preserve">• Subtítulo (36 pt): </w:t>
+              <w:t xml:space="preserve">• Subtítulo (48 pt): </w:t>
             </w:r>
             <w:r>
               <w:rPr>
@@ -17021,7 +17021,7 @@
                 <w:sz w:val="18"/>
                 <w:szCs w:val="18"/>
               </w:rPr>
-              <w:t xml:space="preserve">• Subtítulo (36 pt): </w:t>
+              <w:t xml:space="preserve">• Subtítulo (48 pt): </w:t>
             </w:r>
             <w:r>
               <w:rPr>
@@ -17056,7 +17056,7 @@
                 <w:sz w:val="17"/>
                 <w:szCs w:val="17"/>
               </w:rPr>
-              <w:t xml:space="preserve">Modern anime style 16:9 widescreen illustration. Two 13-year-old student explorers, a girl with braided hair and a boy in a teal jacket, holding open science notebooks, ready to evaluate ethical consent scenarios beside a StudioSimple badge, with generous negative space for text overlays. No text drawn by AI.</w:t>
+              <w:t xml:space="preserve">Modern anime style 16:9 widescreen illustration. Two 13-year-old student explorers, a girl with braided hair and a boy in a teal jacket, holding open science notebooks, ready to evaluate ethical consent scenarios in an organized study room, with generous negative space for text overlays. No text drawn by AI.</w:t>
             </w:r>
           </w:p>
           <w:p>
@@ -17387,7 +17387,7 @@
           <w:sz w:val="19"/>
           <w:szCs w:val="19"/>
         </w:rPr>
-        <w:t xml:space="preserve">Título en Pantalla (64 pt). Subtítulo en Pantalla (36 pt). Texto de un solo color brillante (ej. Blanco Brillante #FFFFFF), elegido para contrastar con el fondo de cada imagen, plano, sin sombras, contornos, resplandores ni recuadros flotantes o fondos detrás del texto. Protagonistas en el 100% de las escenas: la joven con trenzas y el joven con chaqueta cerceta interactuando activamente en cada escena.</w:t>
+        <w:t xml:space="preserve">Título en Pantalla (64 pt). Subtítulo en Pantalla (48 pt). Texto de un solo color brillante (ej. Blanco Brillante #FFFFFF), elegido para contrastar con el fondo de cada imagen, plano, sin sombras, contornos, resplandores ni recuadros flotantes o fondos detrás del texto. Protagonistas en el 100% de las escenas: la joven con trenzas y el joven con chaqueta cerceta interactuando activamente en cada escena.</w:t>
       </w:r>
     </w:p>
     <w:p>
@@ -17474,7 +17474,7 @@
                 <w:sz w:val="18"/>
                 <w:szCs w:val="18"/>
               </w:rPr>
-              <w:t xml:space="preserve">Textos en Pantalla (64 pt / 36 pt)</w:t>
+              <w:t xml:space="preserve">Textos en Pantalla (64 pt / 48 pt)</w:t>
             </w:r>
           </w:p>
         </w:tc>
@@ -17617,7 +17617,7 @@
                 <w:sz w:val="18"/>
                 <w:szCs w:val="18"/>
               </w:rPr>
-              <w:t xml:space="preserve">• Subtítulo (36 pt): </w:t>
+              <w:t xml:space="preserve">• Subtítulo (48 pt): </w:t>
             </w:r>
             <w:r>
               <w:rPr>
@@ -17792,7 +17792,7 @@
                 <w:sz w:val="18"/>
                 <w:szCs w:val="18"/>
               </w:rPr>
-              <w:t xml:space="preserve">• Subtítulo (36 pt): </w:t>
+              <w:t xml:space="preserve">• Subtítulo (48 pt): </w:t>
             </w:r>
             <w:r>
               <w:rPr>
@@ -17967,7 +17967,7 @@
                 <w:sz w:val="18"/>
                 <w:szCs w:val="18"/>
               </w:rPr>
-              <w:t xml:space="preserve">• Subtítulo (36 pt): </w:t>
+              <w:t xml:space="preserve">• Subtítulo (48 pt): </w:t>
             </w:r>
             <w:r>
               <w:rPr>
@@ -18142,7 +18142,7 @@
                 <w:sz w:val="18"/>
                 <w:szCs w:val="18"/>
               </w:rPr>
-              <w:t xml:space="preserve">• Subtítulo (36 pt): </w:t>
+              <w:t xml:space="preserve">• Subtítulo (48 pt): </w:t>
             </w:r>
             <w:r>
               <w:rPr>
@@ -18317,7 +18317,7 @@
                 <w:sz w:val="18"/>
                 <w:szCs w:val="18"/>
               </w:rPr>
-              <w:t xml:space="preserve">• Subtítulo (36 pt): </w:t>
+              <w:t xml:space="preserve">• Subtítulo (48 pt): </w:t>
             </w:r>
             <w:r>
               <w:rPr>
@@ -18492,7 +18492,7 @@
                 <w:sz w:val="18"/>
                 <w:szCs w:val="18"/>
               </w:rPr>
-              <w:t xml:space="preserve">• Subtítulo (36 pt): </w:t>
+              <w:t xml:space="preserve">• Subtítulo (48 pt): </w:t>
             </w:r>
             <w:r>
               <w:rPr>
@@ -18667,7 +18667,7 @@
                 <w:sz w:val="18"/>
                 <w:szCs w:val="18"/>
               </w:rPr>
-              <w:t xml:space="preserve">• Subtítulo (36 pt): </w:t>
+              <w:t xml:space="preserve">• Subtítulo (48 pt): </w:t>
             </w:r>
             <w:r>
               <w:rPr>
@@ -18702,7 +18702,7 @@
                 <w:sz w:val="17"/>
                 <w:szCs w:val="17"/>
               </w:rPr>
-              <w:t xml:space="preserve">Modern anime style 16:9 widescreen illustration. Two 13-year-old student explorers, a girl with braided hair and a boy in a teal jacket, presenting a protective shield with four gold stars representing the criteria of consent beside a StudioSimple emblem, with generous negative space for text overlays. No text drawn by AI.</w:t>
+              <w:t xml:space="preserve">Modern anime style 16:9 widescreen illustration. Two 13-year-old student explorers, a girl with braided hair and a boy in a teal jacket, presenting a protective shield with four gold stars representing the criteria of consent in a bright school setting, with generous negative space for text overlays. No text drawn by AI.</w:t>
             </w:r>
           </w:p>
           <w:p>
@@ -19497,7 +19497,7 @@
         <w:t xml:space="preserve">Pregunta de Síntesis: </w:t>
       </w:r>
       <w:r>
-        <w:t xml:space="preserve"/>
+        <w:t xml:space="preserve">¿Cuáles son los cuatro criterios innegociables del consentimiento informado y por qué revocarlo en cualquier momento es un derecho fundamental?</w:t>
       </w:r>
     </w:p>
     <w:p>
@@ -19512,7 +19512,7 @@
         <w:t xml:space="preserve">Reflexión Metacognitiva: </w:t>
       </w:r>
       <w:r>
-        <w:t xml:space="preserve"/>
+        <w:t xml:space="preserve">¿Qué estrategia aprendida en esta lección te entrega mayor seguridad para manifestar tus límites personales de forma asertiva ante la presión del entorno?</w:t>
       </w:r>
     </w:p>
     <w:p>
@@ -19528,7 +19528,7 @@
         <w:t xml:space="preserve">Celebración y Cierre: </w:t>
       </w:r>
       <w:r>
-        <w:t xml:space="preserve">Has completado la clase con exito.</w:t>
+        <w:t xml:space="preserve">¡Felicitaciones! Has completado con éxito la lección sobre responsabilidad, autocuidado y consentimiento informado.</w:t>
       </w:r>
     </w:p>
     <w:p>
@@ -20139,7 +20139,7 @@
         <w:t xml:space="preserve">Objetivo para el Adulto / Mentor: </w:t>
       </w:r>
       <w:r>
-        <w:t xml:space="preserve">Guiar al estudiante a contrastar mitos y estereotipos sobre la pubertad y la afectividad con la evidencia científica, fomentando la empatía, la aceptación de la diversidad de ritmos biológicos y la convivencia libre de discriminación.</w:t>
+        <w:t xml:space="preserve">Guiar al estudiante a contrastar mitos y estereotipos sobre la pubertad y la afectividad con la evidencia médica, comprendiendo que el estirón puberal de estatura ocurre normalmente entre los 10 y 16 años según los estadios de maduración de Tanner (1962) y curvas MINEDUC/OMS, y que cada cuerpo sigue su propio ritmo genético sin constituir una anomalía.</w:t>
       </w:r>
     </w:p>
     <w:p>
@@ -20609,7 +20609,7 @@
           <w:sz w:val="19"/>
           <w:szCs w:val="19"/>
         </w:rPr>
-        <w:t xml:space="preserve">Título en Pantalla (64 pt). Subtítulo en Pantalla (36 pt). Texto de un solo color brillante (ej. Blanco Brillante #FFFFFF), elegido para contrastar con el fondo de cada imagen, plano, sin sombras, contornos, resplandores ni recuadros flotantes o fondos detrás del texto. Protagonistas en el 100% de las escenas: la joven con trenzas y el joven con chaqueta cerceta interactuando activamente en cada escena.</w:t>
+        <w:t xml:space="preserve">Título en Pantalla (64 pt). Subtítulo en Pantalla (48 pt). Texto de un solo color brillante (ej. Blanco Brillante #FFFFFF), elegido para contrastar con el fondo de cada imagen, plano, sin sombras, contornos, resplandores ni recuadros flotantes o fondos detrás del texto. Protagonistas en el 100% de las escenas: la joven con trenzas y el joven con chaqueta cerceta interactuando activamente en cada escena.</w:t>
       </w:r>
     </w:p>
     <w:p>
@@ -20696,7 +20696,7 @@
                 <w:sz w:val="18"/>
                 <w:szCs w:val="18"/>
               </w:rPr>
-              <w:t xml:space="preserve">Textos en Pantalla (64 pt / 36 pt)</w:t>
+              <w:t xml:space="preserve">Textos en Pantalla (64 pt / 48 pt)</w:t>
             </w:r>
           </w:p>
         </w:tc>
@@ -20839,7 +20839,7 @@
                 <w:sz w:val="18"/>
                 <w:szCs w:val="18"/>
               </w:rPr>
-              <w:t xml:space="preserve">• Subtítulo (36 pt): </w:t>
+              <w:t xml:space="preserve">• Subtítulo (48 pt): </w:t>
             </w:r>
             <w:r>
               <w:rPr>
@@ -21014,7 +21014,7 @@
                 <w:sz w:val="18"/>
                 <w:szCs w:val="18"/>
               </w:rPr>
-              <w:t xml:space="preserve">• Subtítulo (36 pt): </w:t>
+              <w:t xml:space="preserve">• Subtítulo (48 pt): </w:t>
             </w:r>
             <w:r>
               <w:rPr>
@@ -21189,7 +21189,7 @@
                 <w:sz w:val="18"/>
                 <w:szCs w:val="18"/>
               </w:rPr>
-              <w:t xml:space="preserve">• Subtítulo (36 pt): </w:t>
+              <w:t xml:space="preserve">• Subtítulo (48 pt): </w:t>
             </w:r>
             <w:r>
               <w:rPr>
@@ -21364,7 +21364,7 @@
                 <w:sz w:val="18"/>
                 <w:szCs w:val="18"/>
               </w:rPr>
-              <w:t xml:space="preserve">• Subtítulo (36 pt): </w:t>
+              <w:t xml:space="preserve">• Subtítulo (48 pt): </w:t>
             </w:r>
             <w:r>
               <w:rPr>
@@ -21539,7 +21539,7 @@
                 <w:sz w:val="18"/>
                 <w:szCs w:val="18"/>
               </w:rPr>
-              <w:t xml:space="preserve">• Subtítulo (36 pt): </w:t>
+              <w:t xml:space="preserve">• Subtítulo (48 pt): </w:t>
             </w:r>
             <w:r>
               <w:rPr>
@@ -21714,7 +21714,7 @@
                 <w:sz w:val="18"/>
                 <w:szCs w:val="18"/>
               </w:rPr>
-              <w:t xml:space="preserve">• Subtítulo (36 pt): </w:t>
+              <w:t xml:space="preserve">• Subtítulo (48 pt): </w:t>
             </w:r>
             <w:r>
               <w:rPr>
@@ -21889,7 +21889,7 @@
                 <w:sz w:val="18"/>
                 <w:szCs w:val="18"/>
               </w:rPr>
-              <w:t xml:space="preserve">• Subtítulo (36 pt): </w:t>
+              <w:t xml:space="preserve">• Subtítulo (48 pt): </w:t>
             </w:r>
             <w:r>
               <w:rPr>
@@ -21924,7 +21924,7 @@
                 <w:sz w:val="17"/>
                 <w:szCs w:val="17"/>
               </w:rPr>
-              <w:t xml:space="preserve">Modern anime style 16:9 widescreen illustration. Two 13-year-old student explorers, a girl with braided hair and a boy in a teal jacket, holding open science notebooks, ready to debunk myths and analyze evidence beside a StudioSimple badge, with generous negative space for text overlays. No text drawn by AI.</w:t>
+              <w:t xml:space="preserve">Modern anime style 16:9 widescreen illustration. Two 13-year-old student explorers, a girl with braided hair and a boy in a teal jacket, holding open science notebooks, ready to debunk myths and analyze evidence in an organized study room, with generous negative space for text overlays. No text drawn by AI.</w:t>
             </w:r>
           </w:p>
           <w:p>
@@ -22255,7 +22255,7 @@
           <w:sz w:val="19"/>
           <w:szCs w:val="19"/>
         </w:rPr>
-        <w:t xml:space="preserve">Título en Pantalla (64 pt). Subtítulo en Pantalla (36 pt). Texto de un solo color brillante (ej. Blanco Brillante #FFFFFF), elegido para contrastar con el fondo de cada imagen, plano, sin sombras, contornos, resplandores ni recuadros flotantes o fondos detrás del texto. Protagonistas en el 100% de las escenas: la joven con trenzas y el joven con chaqueta cerceta interactuando activamente en cada escena.</w:t>
+        <w:t xml:space="preserve">Título en Pantalla (64 pt). Subtítulo en Pantalla (48 pt). Texto de un solo color brillante (ej. Blanco Brillante #FFFFFF), elegido para contrastar con el fondo de cada imagen, plano, sin sombras, contornos, resplandores ni recuadros flotantes o fondos detrás del texto. Protagonistas en el 100% de las escenas: la joven con trenzas y el joven con chaqueta cerceta interactuando activamente en cada escena.</w:t>
       </w:r>
     </w:p>
     <w:p>
@@ -22342,7 +22342,7 @@
                 <w:sz w:val="18"/>
                 <w:szCs w:val="18"/>
               </w:rPr>
-              <w:t xml:space="preserve">Textos en Pantalla (64 pt / 36 pt)</w:t>
+              <w:t xml:space="preserve">Textos en Pantalla (64 pt / 48 pt)</w:t>
             </w:r>
           </w:p>
         </w:tc>
@@ -22485,7 +22485,7 @@
                 <w:sz w:val="18"/>
                 <w:szCs w:val="18"/>
               </w:rPr>
-              <w:t xml:space="preserve">• Subtítulo (36 pt): </w:t>
+              <w:t xml:space="preserve">• Subtítulo (48 pt): </w:t>
             </w:r>
             <w:r>
               <w:rPr>
@@ -22660,7 +22660,7 @@
                 <w:sz w:val="18"/>
                 <w:szCs w:val="18"/>
               </w:rPr>
-              <w:t xml:space="preserve">• Subtítulo (36 pt): </w:t>
+              <w:t xml:space="preserve">• Subtítulo (48 pt): </w:t>
             </w:r>
             <w:r>
               <w:rPr>
@@ -22835,7 +22835,7 @@
                 <w:sz w:val="18"/>
                 <w:szCs w:val="18"/>
               </w:rPr>
-              <w:t xml:space="preserve">• Subtítulo (36 pt): </w:t>
+              <w:t xml:space="preserve">• Subtítulo (48 pt): </w:t>
             </w:r>
             <w:r>
               <w:rPr>
@@ -23010,7 +23010,7 @@
                 <w:sz w:val="18"/>
                 <w:szCs w:val="18"/>
               </w:rPr>
-              <w:t xml:space="preserve">• Subtítulo (36 pt): </w:t>
+              <w:t xml:space="preserve">• Subtítulo (48 pt): </w:t>
             </w:r>
             <w:r>
               <w:rPr>
@@ -23185,7 +23185,7 @@
                 <w:sz w:val="18"/>
                 <w:szCs w:val="18"/>
               </w:rPr>
-              <w:t xml:space="preserve">• Subtítulo (36 pt): </w:t>
+              <w:t xml:space="preserve">• Subtítulo (48 pt): </w:t>
             </w:r>
             <w:r>
               <w:rPr>
@@ -23315,7 +23315,7 @@
                 <w:sz w:val="17"/>
                 <w:szCs w:val="17"/>
               </w:rPr>
-              <w:t xml:space="preserve">Duración asignada: 20 s</w:t>
+              <w:t xml:space="preserve">Duración asignada: 23 s</w:t>
             </w:r>
           </w:p>
         </w:tc>
@@ -23360,7 +23360,7 @@
                 <w:sz w:val="18"/>
                 <w:szCs w:val="18"/>
               </w:rPr>
-              <w:t xml:space="preserve">• Subtítulo (36 pt): </w:t>
+              <w:t xml:space="preserve">• Subtítulo (48 pt): </w:t>
             </w:r>
             <w:r>
               <w:rPr>
@@ -23438,7 +23438,7 @@
                 <w:sz w:val="18"/>
                 <w:szCs w:val="18"/>
               </w:rPr>
-              <w:t xml:space="preserve">Analicemos un caso concreto: un estudiante de 13 años se angustia creyendo erróneamente que tiene una anomalía porque sus compañeros ya crecieron. La evidencia médica demuestra que el estirón puberal responde a relojes genéticos individuales que se manifiestan normalmente entre los 10 y 16 años.</w:t>
+              <w:t xml:space="preserve">Analicemos un caso concreto: un estudiante de 13 años se angustia creyendo erróneamente que tiene una anomalía porque sus compañeros ya crecieron. La evidencia médica demuestra que el estirón puberal responde a relojes genéticos individuales que se manifiestan normalmente entre los 10 y 16 años según los estadios de Tanner (1962) y curvas MINEDUC/OMS.</w:t>
             </w:r>
           </w:p>
         </w:tc>
@@ -23490,7 +23490,7 @@
                 <w:sz w:val="17"/>
                 <w:szCs w:val="17"/>
               </w:rPr>
-              <w:t xml:space="preserve">Duración asignada: 17 s</w:t>
+              <w:t xml:space="preserve">Duración asignada: 13 s</w:t>
             </w:r>
           </w:p>
         </w:tc>
@@ -23535,7 +23535,7 @@
                 <w:sz w:val="18"/>
                 <w:szCs w:val="18"/>
               </w:rPr>
-              <w:t xml:space="preserve">• Subtítulo (36 pt): </w:t>
+              <w:t xml:space="preserve">• Subtítulo (48 pt): </w:t>
             </w:r>
             <w:r>
               <w:rPr>
@@ -23570,7 +23570,7 @@
                 <w:sz w:val="17"/>
                 <w:szCs w:val="17"/>
               </w:rPr>
-              <w:t xml:space="preserve">Modern anime style 16:9 widescreen illustration. Two 13-year-old student explorers, a girl with braided hair and a boy in a teal jacket, presenting a golden emblem of scientific evidence breaking a chain of myths beside a StudioSimple badge, with generous negative space for text overlays. No text drawn by AI.</w:t>
+              <w:t xml:space="preserve">Modern anime style 16:9 widescreen illustration. Two 13-year-old student explorers, a girl with braided hair and a boy in a teal jacket, presenting an illustrated scientific evidence board dispelling common myths about puberty, with generous negative space for text overlays. No text drawn by AI.</w:t>
             </w:r>
           </w:p>
           <w:p>
@@ -23613,7 +23613,7 @@
                 <w:sz w:val="18"/>
                 <w:szCs w:val="18"/>
               </w:rPr>
-              <w:t xml:space="preserve">Recuerda la regla de oro: la ciencia desmiente prejuicios; cada cuerpo crece a su propio ritmo genético entre los 10 y 16 años. ¡Ahora pon a prueba lo aprendido resolviendo las actividades prácticas en la plataforma interactiva!</w:t>
+              <w:t xml:space="preserve">Recuerda la regla de oro: la ciencia desmiente prejuicios; cada cuerpo crece a su propio ritmo genético. ¡Ahora pon a prueba lo aprendido resolviendo las actividades prácticas en la plataforma interactiva!</w:t>
             </w:r>
           </w:p>
         </w:tc>
@@ -24365,7 +24365,7 @@
         <w:t xml:space="preserve">Pregunta de Síntesis: </w:t>
       </w:r>
       <w:r>
-        <w:t xml:space="preserve"/>
+        <w:t xml:space="preserve">¿Por qué la evidencia médica sobre los relojes genéticos y las curvas de crecimiento de la OMS desmiente que el estirón deba ocurrir simultáneamente en todos los adolescentes?</w:t>
       </w:r>
     </w:p>
     <w:p>
@@ -24380,7 +24380,7 @@
         <w:t xml:space="preserve">Reflexión Metacognitiva: </w:t>
       </w:r>
       <w:r>
-        <w:t xml:space="preserve"/>
+        <w:t xml:space="preserve">¿De qué forma analizar críticamente los mitos y estereotipos de género te permite construir un trato más justo y empático hacia tus pares?</w:t>
       </w:r>
     </w:p>
     <w:p>
@@ -24396,7 +24396,7 @@
         <w:t xml:space="preserve">Celebración y Cierre: </w:t>
       </w:r>
       <w:r>
-        <w:t xml:space="preserve">Has completado la clase con exito.</w:t>
+        <w:t xml:space="preserve">¡Felicitaciones! Has completado con éxito la lección sobre mitos, estereotipos y variabilidad en la pubertad.</w:t>
       </w:r>
     </w:p>
     <w:p>
@@ -25110,7 +25110,7 @@
         <w:t xml:space="preserve">• 3 Tarjetas de Foco de la Pantalla del Alumno: </w:t>
       </w:r>
       <w:r>
-        <w:t xml:space="preserve">[Multidimensionalidad de la sexualidad: Integración de las 5 dimensiones humanas fundamentales] · [Anatomía, fisiología y pubertad: Estructuras biológicas, caracteres sexuales y hormonas] · [Toma de decisiones y convivencia: Autocuidado, consentimiento y superación de mitos]</w:t>
+        <w:t xml:space="preserve">[Multidimensionalidad de la sexualidad: Integración de las 4 dimensiones humanas fundamentales] · [Anatomía, fisiología y pubertad: Estructuras biológicas, caracteres sexuales y hormonas] · [Toma de decisiones y convivencia: Autocuidado, consentimiento y superación de mitos]</w:t>
       </w:r>
     </w:p>
     <w:p>
@@ -25237,7 +25237,7 @@
         <w:t xml:space="preserve">Sub-etapa 4 · Comprendamos la Respuesta (Punto de Referencia): </w:t>
       </w:r>
       <w:r>
-        <w:t xml:space="preserve">El Examen Libre del MINEDUC para 7° Básico evalúa no solo la memoria de nombres anatómicos, sino la comprensión profunda de cómo se interconectan los cambios corporales, las emociones, los valores éticos y el autocuidado en la vida real.</w:t>
+        <w:t xml:space="preserve">La evaluación formativa de Ciencias Naturales para 7° Básico evalúa no solo la memoria de nombres anatómicos, sino la comprensión profunda de cómo se interconectan los cambios corporales, las emociones, los valores éticos y el autocuidado en la vida real.</w:t>
       </w:r>
     </w:p>
     <w:p>
@@ -25269,7 +25269,7 @@
         <w:t xml:space="preserve">• [RESPUESTA ESPERADA]: </w:t>
       </w:r>
       <w:r>
-        <w:t xml:space="preserve">Porque las Bases Curriculares y la ciencia definen la sexualidad como un fenómeno integral constituido por cinco dimensiones inseparables (biológica, afectiva, psicológica, sociocultural y ética), por lo que reducirla solo a lo físico es incompleto y erróneo.</w:t>
+        <w:t xml:space="preserve">Porque las Bases Curriculares y el Texto del Estudiante de Ciencias Naturales 7° Básico MINEDUC (pág. 16) definen la sexualidad como un fenómeno integral constituido por cuatro dimensiones inseparables (biológica, afectiva, social y ética), por lo que reducirla solo a lo físico es incompleto y erróneo.</w:t>
       </w:r>
     </w:p>
     <w:p>
@@ -25317,7 +25317,7 @@
         <w:t xml:space="preserve">• [FEEDBACK SI NECESITA APOYO]: </w:t>
       </w:r>
       <w:r>
-        <w:t xml:space="preserve">Recuerda: la sexualidad incluye afectos, pensamientos, normas éticas y cultura, no únicamente órganos y hormonas.</w:t>
+        <w:t xml:space="preserve">Recuerda: la sexualidad incluye afectos, vínculos sociales y normas éticas, no únicamente órganos y hormonas.</w:t>
       </w:r>
     </w:p>
     <w:p>
@@ -25477,7 +25477,7 @@
           <w:sz w:val="19"/>
           <w:szCs w:val="19"/>
         </w:rPr>
-        <w:t xml:space="preserve">Título en Pantalla (64 pt). Subtítulo en Pantalla (36 pt). Texto de un solo color brillante (ej. Blanco Brillante #FFFFFF), elegido para contrastar con el fondo de cada imagen, plano, sin sombras, contornos, resplandores ni recuadros flotantes o fondos detrás del texto. Protagonistas en el 100% de las escenas: la joven con trenzas y el joven con chaqueta cerceta interactuando activamente en cada escena.</w:t>
+        <w:t xml:space="preserve">Título en Pantalla (64 pt). Subtítulo en Pantalla (48 pt). Texto de un solo color brillante (ej. Blanco Brillante #FFFFFF), elegido para contrastar con el fondo de cada imagen, plano, sin sombras, contornos, resplandores ni recuadros flotantes o fondos detrás del texto. Protagonistas en el 100% de las escenas: la joven con trenzas y el joven con chaqueta cerceta interactuando activamente en cada escena.</w:t>
       </w:r>
     </w:p>
     <w:p>
@@ -25564,7 +25564,7 @@
                 <w:sz w:val="18"/>
                 <w:szCs w:val="18"/>
               </w:rPr>
-              <w:t xml:space="preserve">Textos en Pantalla (64 pt / 36 pt)</w:t>
+              <w:t xml:space="preserve">Textos en Pantalla (64 pt / 48 pt)</w:t>
             </w:r>
           </w:p>
         </w:tc>
@@ -25662,7 +25662,7 @@
                 <w:sz w:val="17"/>
                 <w:szCs w:val="17"/>
               </w:rPr>
-              <w:t xml:space="preserve">Duración asignada: 11 s</w:t>
+              <w:t xml:space="preserve">Duración asignada: 8 s</w:t>
             </w:r>
           </w:p>
         </w:tc>
@@ -25707,7 +25707,7 @@
                 <w:sz w:val="18"/>
                 <w:szCs w:val="18"/>
               </w:rPr>
-              <w:t xml:space="preserve">• Subtítulo (36 pt): </w:t>
+              <w:t xml:space="preserve">• Subtítulo (48 pt): </w:t>
             </w:r>
             <w:r>
               <w:rPr>
@@ -25764,7 +25764,7 @@
                 <w:sz w:val="17"/>
                 <w:szCs w:val="17"/>
               </w:rPr>
-              <w:t xml:space="preserve">Ruta de maestría: 5 Dimensiones -&gt; Fisiología Puberal -&gt; Autocuidado y Consentimiento -&gt; Descarte Metódico</w:t>
+              <w:t xml:space="preserve">Ruta de maestría: 4 Dimensiones -&gt; Fisiología Puberal -&gt; Autocuidado y Consentimiento -&gt; Descarte Metódico</w:t>
             </w:r>
           </w:p>
         </w:tc>
@@ -25785,7 +25785,7 @@
                 <w:sz w:val="18"/>
                 <w:szCs w:val="18"/>
               </w:rPr>
-              <w:t xml:space="preserve">Comienza la clase de síntesis de Ciencias Naturales para el OA 1. Hoy consolidaremos todos los aprendizajes adquiridos a lo largo de esta unidad curricular.</w:t>
+              <w:t xml:space="preserve">Comienza la síntesis de Ciencias del OA 1. Consolidaremos todos los aprendizajes adquiridos en esta unidad.</w:t>
             </w:r>
           </w:p>
         </w:tc>
@@ -25882,14 +25882,14 @@
                 <w:sz w:val="18"/>
                 <w:szCs w:val="18"/>
               </w:rPr>
-              <w:t xml:space="preserve">• Subtítulo (36 pt): </w:t>
-            </w:r>
-            <w:r>
-              <w:rPr>
-                <w:sz w:val="18"/>
-                <w:szCs w:val="18"/>
-              </w:rPr>
-              <w:t xml:space="preserve">Cinco dimensiones articuladas e inseparables</w:t>
+              <w:t xml:space="preserve">• Subtítulo (48 pt): </w:t>
+            </w:r>
+            <w:r>
+              <w:rPr>
+                <w:sz w:val="18"/>
+                <w:szCs w:val="18"/>
+              </w:rPr>
+              <w:t xml:space="preserve">Cuatro dimensiones articuladas e inseparables</w:t>
             </w:r>
           </w:p>
         </w:tc>
@@ -25939,7 +25939,7 @@
                 <w:sz w:val="17"/>
                 <w:szCs w:val="17"/>
               </w:rPr>
-              <w:t xml:space="preserve">Matriz curricular: Dimensión biológica (cuerpo) + psicológica (identidad) + afectiva (vínculos) + social (cultura) + ética (valores)</w:t>
+              <w:t xml:space="preserve">Matriz curricular: Dimensión biológica (cuerpo) + afectiva (emociones) + social (cultura y convivencia) + ética (valores y respeto)</w:t>
             </w:r>
           </w:p>
         </w:tc>
@@ -25960,7 +25960,7 @@
                 <w:sz w:val="18"/>
                 <w:szCs w:val="18"/>
               </w:rPr>
-              <w:t xml:space="preserve">Repasamos que la sexualidad humana es una vivencia integral que articula las dimensiones biológica, afectiva, social y ética durante toda la vida.</w:t>
+              <w:t xml:space="preserve">La sexualidad es una vivencia integral que articula las dimensiones biológica, afectiva, social y ética, según el Texto Oficial MINEDUC (pág. 16).</w:t>
             </w:r>
           </w:p>
         </w:tc>
@@ -26057,7 +26057,7 @@
                 <w:sz w:val="18"/>
                 <w:szCs w:val="18"/>
               </w:rPr>
-              <w:t xml:space="preserve">• Subtítulo (36 pt): </w:t>
+              <w:t xml:space="preserve">• Subtítulo (48 pt): </w:t>
             </w:r>
             <w:r>
               <w:rPr>
@@ -26232,7 +26232,7 @@
                 <w:sz w:val="18"/>
                 <w:szCs w:val="18"/>
               </w:rPr>
-              <w:t xml:space="preserve">• Subtítulo (36 pt): </w:t>
+              <w:t xml:space="preserve">• Subtítulo (48 pt): </w:t>
             </w:r>
             <w:r>
               <w:rPr>
@@ -26407,7 +26407,7 @@
                 <w:sz w:val="18"/>
                 <w:szCs w:val="18"/>
               </w:rPr>
-              <w:t xml:space="preserve">• Subtítulo (36 pt): </w:t>
+              <w:t xml:space="preserve">• Subtítulo (48 pt): </w:t>
             </w:r>
             <w:r>
               <w:rPr>
@@ -26442,7 +26442,7 @@
                 <w:sz w:val="17"/>
                 <w:szCs w:val="17"/>
               </w:rPr>
-              <w:t xml:space="preserve">Modern anime style 16:9 widescreen illustration. Two 13-year-old student explorers, a girl with braided hair and a boy in a teal jacket, holding an emblem of mutual dignity and consent with four interlocking glowing rings, with generous negative space for text overlays. No text drawn by AI.</w:t>
+              <w:t xml:space="preserve">Modern anime style 16:9 widescreen illustration. Two 13-year-old student explorers, a girl with braided hair and a boy in a teal jacket, observing four interlocking glowing rings representing mutual dignity, consent, and respect, with generous negative space for text overlays. No text drawn by AI.</w:t>
             </w:r>
           </w:p>
           <w:p>
@@ -26582,7 +26582,7 @@
                 <w:sz w:val="18"/>
                 <w:szCs w:val="18"/>
               </w:rPr>
-              <w:t xml:space="preserve">• Subtítulo (36 pt): </w:t>
+              <w:t xml:space="preserve">• Subtítulo (48 pt): </w:t>
             </w:r>
             <w:r>
               <w:rPr>
@@ -26757,7 +26757,7 @@
                 <w:sz w:val="18"/>
                 <w:szCs w:val="18"/>
               </w:rPr>
-              <w:t xml:space="preserve">• Subtítulo (36 pt): </w:t>
+              <w:t xml:space="preserve">• Subtítulo (48 pt): </w:t>
             </w:r>
             <w:r>
               <w:rPr>
@@ -26792,7 +26792,7 @@
                 <w:sz w:val="17"/>
                 <w:szCs w:val="17"/>
               </w:rPr>
-              <w:t xml:space="preserve">Modern anime style 16:9 widescreen illustration. Two 13-year-old student explorers, a girl with braided hair and a boy in a teal jacket, holding open science notebooks fully completed, smiling with triumphant focus beside a StudioSimple badge, with generous negative space for text overlays. No text drawn by AI.</w:t>
+              <w:t xml:space="preserve">Modern anime style 16:9 widescreen illustration. Two 13-year-old student explorers, a girl with braided hair and a boy in a teal jacket, holding open science notebooks fully completed, smiling with triumphant focus in an organized study room, with generous negative space for text overlays. No text drawn by AI.</w:t>
             </w:r>
           </w:p>
           <w:p>
@@ -27053,7 +27053,7 @@
         <w:t xml:space="preserve">Idea Clave Disciplinar: </w:t>
       </w:r>
       <w:r>
-        <w:t xml:space="preserve">Resolver reactivos oficiales con rigor exige identificar el distractor parcial y fundamentar la clave correcta mediante la integración de todas las dimensiones del OA 1.</w:t>
+        <w:t xml:space="preserve">Resolver reactivos didácticos tipo MINEDUC con rigor exige identificar el distractor parcial y fundamentar la clave correcta mediante la integración de las 4 dimensiones del OA 1.</w:t>
       </w:r>
     </w:p>
     <w:p>
@@ -27123,7 +27123,7 @@
           <w:sz w:val="19"/>
           <w:szCs w:val="19"/>
         </w:rPr>
-        <w:t xml:space="preserve">Título en Pantalla (64 pt). Subtítulo en Pantalla (36 pt). Texto de un solo color brillante (ej. Blanco Brillante #FFFFFF), elegido para contrastar con el fondo de cada imagen, plano, sin sombras, contornos, resplandores ni recuadros flotantes o fondos detrás del texto. Protagonistas en el 100% de las escenas: la joven con trenzas y el joven con chaqueta cerceta interactuando activamente en cada escena.</w:t>
+        <w:t xml:space="preserve">Título en Pantalla (64 pt). Subtítulo en Pantalla (48 pt). Texto de un solo color brillante (ej. Blanco Brillante #FFFFFF), elegido para contrastar con el fondo de cada imagen, plano, sin sombras, contornos, resplandores ni recuadros flotantes o fondos detrás del texto. Protagonistas en el 100% de las escenas: la joven con trenzas y el joven con chaqueta cerceta interactuando activamente en cada escena.</w:t>
       </w:r>
     </w:p>
     <w:p>
@@ -27210,7 +27210,7 @@
                 <w:sz w:val="18"/>
                 <w:szCs w:val="18"/>
               </w:rPr>
-              <w:t xml:space="preserve">Textos en Pantalla (64 pt / 36 pt)</w:t>
+              <w:t xml:space="preserve">Textos en Pantalla (64 pt / 48 pt)</w:t>
             </w:r>
           </w:p>
         </w:tc>
@@ -27353,7 +27353,7 @@
                 <w:sz w:val="18"/>
                 <w:szCs w:val="18"/>
               </w:rPr>
-              <w:t xml:space="preserve">• Subtítulo (36 pt): </w:t>
+              <w:t xml:space="preserve">• Subtítulo (48 pt): </w:t>
             </w:r>
             <w:r>
               <w:rPr>
@@ -27528,7 +27528,7 @@
                 <w:sz w:val="18"/>
                 <w:szCs w:val="18"/>
               </w:rPr>
-              <w:t xml:space="preserve">• Subtítulo (36 pt): </w:t>
+              <w:t xml:space="preserve">• Subtítulo (48 pt): </w:t>
             </w:r>
             <w:r>
               <w:rPr>
@@ -27703,7 +27703,7 @@
                 <w:sz w:val="18"/>
                 <w:szCs w:val="18"/>
               </w:rPr>
-              <w:t xml:space="preserve">• Subtítulo (36 pt): </w:t>
+              <w:t xml:space="preserve">• Subtítulo (48 pt): </w:t>
             </w:r>
             <w:r>
               <w:rPr>
@@ -27878,7 +27878,7 @@
                 <w:sz w:val="18"/>
                 <w:szCs w:val="18"/>
               </w:rPr>
-              <w:t xml:space="preserve">• Subtítulo (36 pt): </w:t>
+              <w:t xml:space="preserve">• Subtítulo (48 pt): </w:t>
             </w:r>
             <w:r>
               <w:rPr>
@@ -28053,7 +28053,7 @@
                 <w:sz w:val="18"/>
                 <w:szCs w:val="18"/>
               </w:rPr>
-              <w:t xml:space="preserve">• Subtítulo (36 pt): </w:t>
+              <w:t xml:space="preserve">• Subtítulo (48 pt): </w:t>
             </w:r>
             <w:r>
               <w:rPr>
@@ -28228,7 +28228,7 @@
                 <w:sz w:val="18"/>
                 <w:szCs w:val="18"/>
               </w:rPr>
-              <w:t xml:space="preserve">• Subtítulo (36 pt): </w:t>
+              <w:t xml:space="preserve">• Subtítulo (48 pt): </w:t>
             </w:r>
             <w:r>
               <w:rPr>
@@ -28285,7 +28285,7 @@
                 <w:sz w:val="17"/>
                 <w:szCs w:val="17"/>
               </w:rPr>
-              <w:t xml:space="preserve">Despiece del ítem: Enunciado: Estudiante afirma que la sexualidad es solo biología reproductiva -&gt; Opción A (Falsa: reduccionista) · Opción B (CLAVE CORRECTA: 5 dimensiones integrales) · Opción C (Falsa: inicio tardío erróneo) · Opción D (Falsa: niega afecto en la niñez)</w:t>
+              <w:t xml:space="preserve">Despiece del ítem: Enunciado: Estudiante afirma que la sexualidad es solo biología reproductiva -&gt; Opción A (Falsa: reduccionista) · Opción B (CLAVE CORRECTA: 4 dimensiones integrales) · Opción C (Falsa: inicio tardío erróneo) · Opción D (Falsa: niega afecto en la niñez)</w:t>
             </w:r>
           </w:p>
         </w:tc>
@@ -28306,7 +28306,7 @@
                 <w:sz w:val="18"/>
                 <w:szCs w:val="18"/>
               </w:rPr>
-              <w:t xml:space="preserve">Analicemos un ítem modelado: un estudiante afirma que la sexualidad se limita exclusivamente a órganos y procreación. A partir del MINEDUC, ¿cuál opción refuta dicha postura? La opción B es correcta porque establece que la sexualidad es una dimensión integral que une lo biológico, afectivo, psicológico, sociocultural y ético durante toda la vida.</w:t>
+              <w:t xml:space="preserve">Analicemos un reactivo didáctico elaborado según estándar MINEDUC: un estudiante afirma que la sexualidad se limita exclusivamente a órganos y procreación. A partir del Texto Oficial MINEDUC (pág. 16), ¿cuál opción refuta dicha postura? La opción B es correcta porque establece que la sexualidad es una dimensión integral que une lo biológico, afectivo, social y ético durante toda la vida.</w:t>
             </w:r>
           </w:p>
         </w:tc>
@@ -28403,14 +28403,14 @@
                 <w:sz w:val="18"/>
                 <w:szCs w:val="18"/>
               </w:rPr>
-              <w:t xml:space="preserve">• Subtítulo (36 pt): </w:t>
-            </w:r>
-            <w:r>
-              <w:rPr>
-                <w:sz w:val="18"/>
-                <w:szCs w:val="18"/>
-              </w:rPr>
-              <w:t xml:space="preserve">Preparados para el Examen Libre</w:t>
+              <w:t xml:space="preserve">• Subtítulo (48 pt): </w:t>
+            </w:r>
+            <w:r>
+              <w:rPr>
+                <w:sz w:val="18"/>
+                <w:szCs w:val="18"/>
+              </w:rPr>
+              <w:t xml:space="preserve">Preparados para la evaluación formativa</w:t>
             </w:r>
           </w:p>
         </w:tc>
@@ -28438,7 +28438,7 @@
                 <w:sz w:val="17"/>
                 <w:szCs w:val="17"/>
               </w:rPr>
-              <w:t xml:space="preserve">Modern anime style 16:9 widescreen illustration. Two 13-year-old student explorers, a girl with braided hair and a boy in a teal jacket, presenting a golden laurel emblem of curricular mastery in Ciencias Naturales OA 01 beside a StudioSimple badge, with generous negative space for text overlays. No text drawn by AI.</w:t>
+              <w:t xml:space="preserve">Modern anime style 16:9 widescreen illustration. Two 13-year-old student explorers, a girl with braided hair and a boy in a teal jacket, presenting a completed scientific summary board of 7th grade Ciencias Naturales with bright confident smiles, with generous negative space for text overlays. No text drawn by AI.</w:t>
             </w:r>
           </w:p>
           <w:p>
@@ -28481,7 +28481,7 @@
                 <w:sz w:val="18"/>
                 <w:szCs w:val="18"/>
               </w:rPr>
-              <w:t xml:space="preserve">Recuerda la regla de oro: la justificación científica y el descarte de distractores aseguran el éxito en el examen. ¡Ahora pon a prueba lo aprendido resolviendo las actividades prácticas en la plataforma interactiva!</w:t>
+              <w:t xml:space="preserve">Recuerda la regla de oro: la justificación científica y el descarte de distractores aseguran el éxito en la evaluación. ¡Ahora pon a prueba lo aprendido resolviendo las actividades prácticas en la plataforma interactiva!</w:t>
             </w:r>
           </w:p>
         </w:tc>
@@ -28509,14 +28509,14 @@
           <w:b/>
           <w:bCs/>
         </w:rPr>
-        <w:t xml:space="preserve">Comprobación 1 (Caso 1: Ítem oficial de selección múltiple (Estándar MINEDUC)): </w:t>
-      </w:r>
-      <w:r>
-        <w:t xml:space="preserve">Un examen oficial presenta la siguiente pregunta de selección múltiple:
+        <w:t xml:space="preserve">Comprobación 1 (Caso 1: Reactivo didáctico de selección múltiple (Estándar MINEDUC)): </w:t>
+      </w:r>
+      <w:r>
+        <w:t xml:space="preserve">A continuación se presenta un reactivo didáctico elaborado según estándar MINEDUC para 7° Básico:
 'Durante una clase de Ciencias Naturales, los estudiantes debaten sobre la sexualidad humana. Uno de ellos afirma que la sexualidad se limita exclusivamente a los procesos biológicos de maduración de los órganos reproductores y a la capacidad de procrear.'
-A partir de las Bases Curriculares del MINEDUC, ¿cuál de las siguientes opciones refuta con mayor precisión científica y pedagógica dicha afirmación?
+A partir de las Bases Curriculares y el Texto Oficial de Ciencias Naturales (pág. 16), ¿cuál de las siguientes opciones refuta con mayor precisión científica y pedagógica dicha afirmación?
 A) La afirmación es correcta porque las hormonas y los caracteres sexuales primarios son las únicas variables medibles empíricamente.
-B) La afirmación es incompleta porque la sexualidad humana es una dimensión integral que involucra aspectos biológicos, afectivos, psicológicos, socioculturales y éticos a lo largo de toda la vida.
+B) La afirmación es incompleta porque la sexualidad humana es una dimensión integral que involucra aspectos biológicos, afectivos, sociales y éticos a lo largo de toda la vida.
 C) La afirmación es incorrecta porque la sexualidad solo comienza en la adultez cuando se forman vínculos legales formales.
 D) La afirmación es válida únicamente para la etapa de la pubertad, pues en la niñez no existen influencias afectivas ni sociales.
 Indica la alternativa correcta y justifica por qué descartaste las otras tres opciones.</w:t>
@@ -28646,14 +28646,14 @@
           <w:b/>
           <w:bCs/>
         </w:rPr>
-        <w:t xml:space="preserve">Ejercicio 1 (Caso 1: Ítem oficial de selección múltiple (Estándar MINEDUC)): </w:t>
-      </w:r>
-      <w:r>
-        <w:t xml:space="preserve">Un examen oficial presenta la siguiente pregunta de selección múltiple:
+        <w:t xml:space="preserve">Ejercicio 1 (Caso 1: Reactivo didáctico de selección múltiple (Estándar MINEDUC)): </w:t>
+      </w:r>
+      <w:r>
+        <w:t xml:space="preserve">A continuación se presenta un reactivo didáctico elaborado según estándar MINEDUC para 7° Básico:
 'Durante una clase de Ciencias Naturales, los estudiantes debaten sobre la sexualidad humana. Uno de ellos afirma que la sexualidad se limita exclusivamente a los procesos biológicos de maduración de los órganos reproductores y a la capacidad de procrear.'
-A partir de las Bases Curriculares del MINEDUC, ¿cuál de las siguientes opciones refuta con mayor precisión científica y pedagógica dicha afirmación?
+A partir de las Bases Curriculares y el Texto Oficial de Ciencias Naturales (pág. 16), ¿cuál de las siguientes opciones refuta con mayor precisión científica y pedagógica dicha afirmación?
 A) La afirmación es correcta porque las hormonas y los caracteres sexuales primarios son las únicas variables medibles empíricamente.
-B) La afirmación es incompleta porque la sexualidad humana es una dimensión integral que involucra aspectos biológicos, afectivos, psicológicos, socioculturales y éticos a lo largo de toda la vida.
+B) La afirmación es incompleta porque la sexualidad humana es una dimensión integral que involucra aspectos biológicos, afectivos, sociales y éticos a lo largo de toda la vida.
 C) La afirmación es incorrecta porque la sexualidad solo comienza en la adultez cuando se forman vínculos legales formales.
 D) La afirmación es válida únicamente para la etapa de la pubertad, pues en la niñez no existen influencias afectivas ni sociales.
 Indica la alternativa correcta y justifica por qué descartaste las otras tres opciones.</w:t>
@@ -28745,7 +28745,7 @@
         <w:t xml:space="preserve">Ejercicio 3 (Caso 3: Trabajo en el Cuaderno de Ciencias - Hoja de Examen): </w:t>
       </w:r>
       <w:r>
-        <w:t xml:space="preserve">Abre tu cuaderno de Ciencias Naturales en una página limpia. Escribe como título: 'Hoja de Respuestas y Síntesis Final OA 1'. Diseña un cuadro resumen con los 4 grandes ejes de la unidad: 1. Las 5 dimensiones humanas, 2. Órganos y hormonas de la pubertad, 3. Autocuidado y consentimiento, 4. Mitos derribados. Escribe dos conceptos clave para cada eje.</w:t>
+        <w:t xml:space="preserve">Abre tu cuaderno de Ciencias Naturales en una página limpia. Escribe como título: 'Hoja de Respuestas y Síntesis Final OA 1'. Diseña un cuadro resumen con los 4 grandes ejes de la unidad: 1. Las 4 dimensiones humanas (biológica, afectiva, social y ética), 2. Órganos y hormonas de la pubertad, 3. Autocuidado y consentimiento, 4. Mitos derribados. Escribe dos conceptos clave para cada eje.</w:t>
       </w:r>
     </w:p>
     <w:p>
@@ -28797,7 +28797,7 @@
         <w:t xml:space="preserve">Idea Clave: </w:t>
       </w:r>
       <w:r>
-        <w:t xml:space="preserve">Resolver reactivos oficiales con rigor exige identificar el distractor parcial y fundamentar la clave correcta mediante la integración de todas las dimensiones del OA 1.</w:t>
+        <w:t xml:space="preserve">Resolver reactivos didácticos tipo MINEDUC con rigor exige identificar el distractor parcial y fundamentar la clave correcta mediante la integración de las 4 dimensiones del OA 1.</w:t>
       </w:r>
     </w:p>
     <w:p>
@@ -28813,7 +28813,7 @@
         <w:t xml:space="preserve">Estrategia para Pensar: </w:t>
       </w:r>
       <w:r>
-        <w:t xml:space="preserve">1. 1 · Visión Holística del OA 1: La sexualidad humana articula de forma inseparable las dimensiones biológica, afectiva, psicológica, social y ética durante toda la existencia. · 2. 2 · Fisiología, Autocuidado y Consentimiento: Comprender la función hormonal, respetar los límites corporales y ejercer la asertividad garantizan una vida sana y segura. · 3. 3 · Éxito en Evaluaciones Oficiales: El análisis crítico de los enunciados y el descarte metódico de distractores permiten resolver con solidez los Exámenes Libres del MINEDUC.</w:t>
+        <w:t xml:space="preserve">1. 1 · Visión Holística del OA 1: La sexualidad humana articula de forma inseparable las dimensiones biológica, afectiva, social y ética durante toda la existencia. · 2. 2 · Fisiología, Autocuidado y Consentimiento: Comprender la función hormonal, respetar los límites corporales y ejercer la asertividad garantizan una vida sana y segura. · 3. 3 · Éxito en Evaluaciones Oficiales: El análisis crítico de los enunciados y el descarte metódico de distractores permiten resolver con solidez los Exámenes Libres del MINEDUC.</w:t>
       </w:r>
     </w:p>
     <w:p>
@@ -28841,7 +28841,7 @@
         <w:t xml:space="preserve">   • 1 · Visión Holística del OA 1: </w:t>
       </w:r>
       <w:r>
-        <w:t xml:space="preserve">La sexualidad humana articula de forma inseparable las dimensiones biológica, afectiva, psicológica, social y ética durante toda la existencia.</w:t>
+        <w:t xml:space="preserve">La sexualidad humana articula de forma inseparable las dimensiones biológica, afectiva, social y ética durante toda la existencia.</w:t>
       </w:r>
     </w:p>
     <w:p>
@@ -29171,7 +29171,7 @@
           <w:i/>
           <w:iCs/>
         </w:rPr>
-        <w:t xml:space="preserve">La variabilidad cronológica en el inicio puberal (entre 9-13 años en niñas y 10-14 en niños) es una característica biológica normal.</w:t>
+        <w:t xml:space="preserve">La variabilidad cronológica en el inicio puberal (entre 8-13 años en niñas y 9-14 en niños según Tanner 1962 y MINEDUC) es una característica biológica normal.</w:t>
       </w:r>
     </w:p>
     <w:p>
@@ -29210,7 +29210,7 @@
         <w:t xml:space="preserve">Ítem de Recuperación 1 (Recuperación: El Enfoque Integral del MINEDUC): </w:t>
       </w:r>
       <w:r>
-        <w:t xml:space="preserve">¿Qué dimensiones integran la sexualidad humana de acuerdo a las Bases Curriculares?</w:t>
+        <w:t xml:space="preserve">¿Qué dimensiones integran la sexualidad humana de acuerdo a las Bases Curriculares y el Texto Oficial (pág. 16)?</w:t>
       </w:r>
     </w:p>
     <w:p>
@@ -29222,18 +29222,18 @@
           <w:i/>
           <w:iCs/>
         </w:rPr>
-        <w:t xml:space="preserve">Explicación previa: El Ministerio de Educación de Chile enfatiza que la sexualidad no es únicamente un fenómeno de órganos y hormonas. Comprende cómo nos sentimos, cómo nos relacionamos con los demás, nuestros valores éticos y el respeto por los derechos humanos de cada individuo.
+        <w:t xml:space="preserve">Explicación previa: El Ministerio de Educación de Chile enfatiza que la sexualidad no es únicamente un fenómeno de órganos y hormonas. Comprende cómo nos sentimos, cómo nos relacionamos con los demás, nuestros valores éticos y el respeto por los derechos humanos de cada individuo (Texto Oficial pág. 16).
 </w:t>
       </w:r>
       <w:r>
-        <w:t xml:space="preserve">Opciones: Biológica, afectiva, psicológica, sociocultural y ética a lo largo de toda la vida | Únicamente la dimensión biológica y la reproducción en la etapa adulta | Correcta: Biológica, afectiva, psicológica, sociocultural y ética a lo largo de toda la vida
+        <w:t xml:space="preserve">Opciones: Biológica, afectiva, social y ética a lo largo de toda la vida | Únicamente la dimensión biológica y la reproducción en la etapa adulta | Correcta: Biológica, afectiva, social y ética a lo largo de toda la vida
 </w:t>
       </w:r>
       <w:r>
         <w:rPr>
           <w:color w:val="B45309"/>
         </w:rPr>
-        <w:t xml:space="preserve">Refuerzo: Recuerda que la sexualidad es un fenómeno integral con 5 dimensiones inseparables, no solo biología.</w:t>
+        <w:t xml:space="preserve">Refuerzo: Recuerda que la sexualidad es un fenómeno integral con 4 dimensiones inseparables, no solo biología.</w:t>
       </w:r>
     </w:p>
     <w:p>
@@ -29257,7 +29257,7 @@
         <w:t xml:space="preserve">Pregunta de Síntesis: </w:t>
       </w:r>
       <w:r>
-        <w:t xml:space="preserve"/>
+        <w:t xml:space="preserve">¿Cómo se articulan las cuatro dimensiones de la sexualidad (biológica, afectiva, social y ética) para responder con rigor científico a preguntas y situaciones de la vida real?</w:t>
       </w:r>
     </w:p>
     <w:p>
@@ -29272,7 +29272,7 @@
         <w:t xml:space="preserve">Reflexión Metacognitiva: </w:t>
       </w:r>
       <w:r>
-        <w:t xml:space="preserve"/>
+        <w:t xml:space="preserve">¿Qué estrategia de lectura analítica y descarte de distractores te resultó más efectiva para resolver reactivos de evaluación formal con confianza?</w:t>
       </w:r>
     </w:p>
     <w:p>
@@ -29288,7 +29288,7 @@
         <w:t xml:space="preserve">Celebración y Cierre: </w:t>
       </w:r>
       <w:r>
-        <w:t xml:space="preserve">Has completado la clase con exito.</w:t>
+        <w:t xml:space="preserve">¡Felicitaciones! Has completado con éxito la unidad completa del OA 1 de Ciencias Naturales de 7° Básico.</w:t>
       </w:r>
     </w:p>
     <w:p>
@@ -29549,14 +29549,14 @@
           <w:bCs/>
           <w:color w:val="0F766E"/>
         </w:rPr>
-        <w:t xml:space="preserve">Ejercicio 1 [Caso 1: Ítem oficial de selección múltiple (Estándar MINEDUC)]: </w:t>
-      </w:r>
-      <w:r>
-        <w:t xml:space="preserve">Un examen oficial presenta la siguiente pregunta de selección múltiple:
+        <w:t xml:space="preserve">Ejercicio 1 [Caso 1: Reactivo didáctico de selección múltiple (Estándar MINEDUC)]: </w:t>
+      </w:r>
+      <w:r>
+        <w:t xml:space="preserve">A continuación se presenta un reactivo didáctico elaborado según estándar MINEDUC para 7° Básico:
 'Durante una clase de Ciencias Naturales, los estudiantes debaten sobre la sexualidad humana. Uno de ellos afirma que la sexualidad se limita exclusivamente a los procesos biológicos de maduración de los órganos reproductores y a la capacidad de procrear.'
-A partir de las Bases Curriculares del MINEDUC, ¿cuál de las siguientes opciones refuta con mayor precisión científica y pedagógica dicha afirmación?
+A partir de las Bases Curriculares y el Texto Oficial de Ciencias Naturales (pág. 16), ¿cuál de las siguientes opciones refuta con mayor precisión científica y pedagógica dicha afirmación?
 A) La afirmación es correcta porque las hormonas y los caracteres sexuales primarios son las únicas variables medibles empíricamente.
-B) La afirmación es incompleta porque la sexualidad humana es una dimensión integral que involucra aspectos biológicos, afectivos, psicológicos, socioculturales y éticos a lo largo de toda la vida.
+B) La afirmación es incompleta porque la sexualidad humana es una dimensión integral que involucra aspectos biológicos, afectivos, sociales y éticos a lo largo de toda la vida.
 C) La afirmación es incorrecta porque la sexualidad solo comienza en la adultez cuando se forman vínculos legales formales.
 D) La afirmación es válida únicamente para la etapa de la pubertad, pues en la niñez no existen influencias afectivas ni sociales.
 Indica la alternativa correcta y justifica por qué descartaste las otras tres opciones.</w:t>
@@ -29616,7 +29616,7 @@
         <w:t xml:space="preserve">Ejercicio 3 [Caso 3: Trabajo en el Cuaderno de Ciencias - Hoja de Examen]: </w:t>
       </w:r>
       <w:r>
-        <w:t xml:space="preserve">Abre tu cuaderno de Ciencias Naturales en una página limpia. Escribe como título: 'Hoja de Respuestas y Síntesis Final OA 1'. Diseña un cuadro resumen con los 4 grandes ejes de la unidad: 1. Las 5 dimensiones humanas, 2. Órganos y hormonas de la pubertad, 3. Autocuidado y consentimiento, 4. Mitos derribados. Escribe dos conceptos clave para cada eje.</w:t>
+        <w:t xml:space="preserve">Abre tu cuaderno de Ciencias Naturales en una página limpia. Escribe como título: 'Hoja de Respuestas y Síntesis Final OA 1'. Diseña un cuadro resumen con los 4 grandes ejes de la unidad: 1. Las 4 dimensiones humanas (biológica, afectiva, social y ética), 2. Órganos y hormonas de la pubertad, 3. Autocuidado y consentimiento, 4. Mitos derribados. Escribe dos conceptos clave para cada eje.</w:t>
       </w:r>
     </w:p>
     <w:p>

</xml_diff>